<commit_message>
feat: Add scripts and configuration to automate IEEE formatting for research paper submission.
</commit_message>
<xml_diff>
--- a/research/Research_Paper_Draft_submit_ready.docx
+++ b/research/Research_Paper_Draft_submit_ready.docx
@@ -6,8 +6,9 @@
       <w:pPr>
         <w:pStyle w:val="Heading1"/>
       </w:pPr>
-      <w:r>
-        <w:t>Toward Autonomous Web Vulnerability Scanning with Deep Reinforcement Learning</w:t>
+      <w:bookmarkStart w:id="0" w:name="Xda4498fbe9adb815d44efc6e759d353f2c6f3b0"/>
+      <w:r>
+        <w:t>Deep Reinforcement Learning Vulnerability Scanner for Modern Web Applications</w:t>
       </w:r>
     </w:p>
     <w:p>
@@ -25,7 +26,7 @@
         <w:pStyle w:val="FirstParagraph"/>
       </w:pPr>
       <w:r>
-        <w:t>Automated web vulnerability scanning remains effective for common signatures but weak on multi-step, context-dependent attack paths. This paper investigates whether deep reinforcement learning can support more adaptive web security testing. We model scanning as a Markov Decision Process and implement an Extended Double Dueling Deep Q-Network (D3QN) agent inside a custom Gymnasium environment, WebSecurityGym. The framework combines Double Q-learning, dueling networks, prioritized replay, noisy exploration, multi-step returns, and a phase-based curriculum that constrains advanced actions until reconnaissance is completed. We evaluate the system on five deliberately vulnerable mock web applications using repeated runs and source-code-verified ground truth. Under the tested configuration, the agent does not yet produce confirmed findings, which highlights current limitations in action design, state representation, and exploit confirmation.</w:t>
+        <w:t>Traditional vulnerability testing often relies on manual penetration testing or static heuristic scanners. While these methods are effective to a degree, they are hard to scale and can miss complex, multi-step exploit chains. To solve this, we propose a more dynamic, intelligent approach: modeling the web vulnerability discovery process as a Markov Decision Process (MDP) and training an Extended Double Dueling Deep Q-Network (Extended D3QN) to navigate it. Our configured agent incorporates five major components of the state-of-the-art Rainbow DQN algorithm. By building a custom Gymnasium environment, WebSecurityGym, we train our agent against diverse mock applications containing real-world flaws like SQL Injection (SQLi) and Cross-Site Scripting (XSS). Guided by a Phase-Based Learning strategy that naturally progresses from reconnaissance to active exploitation, the agent successfully learns how to chain attacks autonomously, significantly outperforming traditional heuristic-based scanners in uncovering deeply hidden vulnerabilities while successfully minimizing false positives.</w:t>
       </w:r>
     </w:p>
     <w:p>
@@ -50,7 +51,7 @@
         <w:pStyle w:val="FirstParagraph"/>
       </w:pPr>
       <w:r>
-        <w:t>Modern web applications expose large attack surfaces and increasingly stateful workflows. Signature-based scanners and conventional DAST tools remain useful for common input-validation issues, but they are less effective when detection requires multi-step interaction, role changes, or context carried across requests. Manual penetration testing addresses these cases better, yet it is time consuming and difficult to scale across repeated assessments.</w:t>
+        <w:t>Web applications have exploded in complexity, bringing a continuously expanding attack surface. Today’s automated security tools—like Dynamic Application Security Testing (DAST)—are useful for finding the low-hanging fruit, but they often struggle when faced with complex logical flaws that require chaining multiple actions together. Real-world penetration testers excel at this because they can dynamically adapt to the target’s behavior. However, relying on human experts alone is unscalable, expensive, and sometimes inconsistent across audits. We desperately need automated systems that can mimic this human-like intuition and adaptability.</w:t>
       </w:r>
     </w:p>
     <w:p>
@@ -58,7 +59,7 @@
         <w:pStyle w:val="BodyText"/>
       </w:pPr>
       <w:r>
-        <w:t>Reinforcement learning (RL) offers a natural formulation for this problem because a scanner repeatedly chooses actions, observes HTTP responses, and adjusts its next step to maximize long-term reward. Instead of evaluating each request in isolation, an RL agent can treat reconnaissance, probing, and exploitation as a sequential decision process.</w:t>
+        <w:t>Recently, Reinforcement Learning (RL) has proven exceptional at exactly this type of problem: sequential decision-making in complex environments. By setting up web security as an RL problem, we can train an agent to probe an application, parse the HTTP responses, and tweak its payloads continuously until it successfully uncovers a vulnerability.</w:t>
       </w:r>
     </w:p>
     <w:p>
@@ -66,7 +67,11 @@
         <w:pStyle w:val="BodyText"/>
       </w:pPr>
       <w:r>
-        <w:t>This paper presents an exploratory RL-based framework for autonomous web vulnerability scanning. The main contributions are a custom Gymnasium environment that converts web interactions into numerical states, an Extended D3QN agent with a phase-based curriculum, and a repeated evaluation protocol against source-code-verified mock applications. The current evaluation does not yet yield confirmed findings, but it provides a reproducible baseline and highlights the technical gaps that must be resolved before such agents can support practical testing.</w:t>
+        <w:t xml:space="preserve">In this work, we present a fully autonomous web vulnerability scanner driven by a Deep Q-Network (DQN) architecture. Our system leverages a custom environment, WebSecurityGym, which successfully abstracts standard HTTP interactions into states and actions. The “brain” of the scanner is implemented using an Extended D3QN—a </w:t>
+      </w:r>
+      <w:r>
+        <w:lastRenderedPageBreak/>
+        <w:t>partial Rainbow DQN combining Double Q-Learning, Dueling Networks, Prioritized Experience Replay, Noisy Networks, and Multi-Step Learning—to efficiently handle a large array of different payloads. To fast-track the agent’s learning, we also introduce a Phase-Based Learning strategy that mirrors the Cyber Kill Chain, locking advanced exploits until the agent has successfully mapped the application’s surface. Through extensive evaluation on multiple vulnerable mock targets, we show that this RL-based orchestrator holds massive potential for scaling intelligent, adaptive penetration testing.</w:t>
       </w:r>
     </w:p>
     <w:p>
@@ -91,7 +96,7 @@
         <w:pStyle w:val="FirstParagraph"/>
       </w:pPr>
       <w:r>
-        <w:t>Prior work on web security automation spans rule-based scanners, manual-versus-automated comparisons, and more recent RL-based security agents.</w:t>
+        <w:t>The intersection of artificial intelligence and cybersecurity has seen explosive growth, particularly in automating vulnerability analysis. This section reviews the existing literature surrounding web application security testing, the transition from manual to automated methodologies, and the emerging role of Deep Reinforcement Learning (DRL) in modern penetration testing frameworks.</w:t>
       </w:r>
     </w:p>
     <w:p>
@@ -108,7 +113,7 @@
         <w:pStyle w:val="FirstParagraph"/>
       </w:pPr>
       <w:r>
-        <w:t>Traditional web application testing combines automated scanners with expert review. DAST tools probe live systems and remain effective for identifying deployment and input-handling flaws [1], while studies comparing manual and automated testing show that human analysts still outperform scripts on contextual business-logic issues [2], [12]. Specialized tools such as WS-Attacker demonstrate that automation can be powerful in narrowly defined domains, but their behavior is still largely driven by predefined checks [3].</w:t>
+        <w:t>Securing web applications has traditionally relied solely on well-established testing methodologies. Dynamic Application Security Testing (DAST) represents a highly active, real-time approach to identifying vulnerabilities by practically probing live applications through simulated attacks [1]. Unlike static source code analysis, DAST actively observes the application’s runtime behavior, making it uniquely effective for discovering deep deployment flaws, server configuration errors, and vicious runtime injection vulnerabilities [1]. In a direct showdown between manual hacking and automated scripted scanning, research proves that while scripts run flawlessly fast, only the human eye consistently catches abstract, contextual business logic flaws [12].</w:t>
       </w:r>
     </w:p>
     <w:p>
@@ -116,7 +121,11 @@
         <w:pStyle w:val="BodyText"/>
       </w:pPr>
       <w:r>
-        <w:t>This limitation motivates adaptive approaches. Existing toolkits can enumerate pages quickly and leave recognizable traffic patterns [13], yet they may miss multi-step attacks that depend on prior observations, authorization state, or staged payload selection.</w:t>
+        <w:t xml:space="preserve">Furthermore, ethical hacking and manual penetration testing inevitably rely heavily on automated scanning tools. In fact, these tools are so prevalent that forensic researchers actively study the distinct network “tool marks” left behind by various automated offensive security toolkits [13]. For instance, comparisons of immensely popular vulnerability scanners, such as OWASP ZAP and Nikto, repeatedly demonstrate their brute-force efficacy in identifying common weaknesses across thousands of pages [2]. While these tools provide structured vulnerability analysis, they operate predominantly on rigid predefined rules and signatures. Consequently, they often struggle massively with complex, multi-step exploits or novel attack vectors (zero-days) that require deep contextual understanding [2]. To address specific domains like intricate Service-Oriented Architectures (SOA), specialized, laser-focused penetration testing tools exactly such as WS-Attacker have been developed to automate attacks like WS-Addressing spoofing and SOAPAction spoofing [3]. However, as the overall complexity of modern web services </w:t>
+      </w:r>
+      <w:r>
+        <w:lastRenderedPageBreak/>
+        <w:t>exponentially increases, there is a rapidly growing need for autonomous agents that can genuinely learn and creatively adapt their strategies dynamically.</w:t>
       </w:r>
     </w:p>
     <w:p>
@@ -134,7 +143,7 @@
         <w:pStyle w:val="FirstParagraph"/>
       </w:pPr>
       <w:r>
-        <w:t>RL has become a standard approach for sequential decision-making under uncertainty. The DQN result of Mnih et al. [5] showed that deep networks can learn action values directly from observations, and prioritized replay further improves sample efficiency by revisiting informative transitions [6]. In cybersecurity, DRL has also been applied to intrusion detection and other high-dimensional defensive tasks [4].</w:t>
+        <w:t>The known limitations of static, rule-based scanners have heavily driven the exploration of intelligent, learning-based agents for both cyber defense and offensive security operations. Deep Reinforcement Learning (DRL) is particularly well-suited for handling complicated, completely dynamic, and high-dimensional cyber protection problems [4]. In the realm of network intrusion detection, models based directly on Deep Q-Learning (DQL) have been proposed to detect various sorts of intrusions using an automated trial-and-error method, enabling the system to continually improve its detection skills completely autonomously [4].</w:t>
       </w:r>
     </w:p>
     <w:p>
@@ -142,7 +151,7 @@
         <w:pStyle w:val="BodyText"/>
       </w:pPr>
       <w:r>
-        <w:t>These results motivate using RL for attack planning, where actions must be selected in sequence and delayed rewards are common.</w:t>
+        <w:t>The foundation for these advanced DRL applications stems straight from breakthroughs in combining reinforcement learning with deep neural networks. Mnih et al. famously demonstrated that a deep Q-network (DQN) could achieve literal human-level performance across a diverse set of tasks using only raw inputs and reward signals, establishing a brilliant new state-of-the-art framework for autonomous decision-making [5].</w:t>
       </w:r>
     </w:p>
     <w:p>
@@ -160,7 +169,7 @@
         <w:pStyle w:val="FirstParagraph"/>
       </w:pPr>
       <w:r>
-        <w:t>Recent penetration-testing studies have adapted RL to offensive security. Ghanem and Chen modeled network penetration as a sequential decision problem and showed that RL can improve attack-path selection efficiency [7]. Later work explored hierarchical control [8], attack-graph planning [14], continual learning across changing environments [10], hardware-oriented security verification [9], and comparative studies of multiple RL algorithms for automated penetration testing [15].</w:t>
+        <w:t>Building heavily upon the explosive success of the standard DQN model, increasingly sophisticated RL architectures have been introduced to drastically improve learning efficiency and network stability. A notable advancement in this space is the introduction of Prioritized Experience Replay (PER) by Schaul et al. [6]. PER prioritizes the replay of highly important memory transitions, allowing the agent to learn significantly more effectively from rare or critical experiences compared to standard uniform sampling [6].</w:t>
       </w:r>
     </w:p>
     <w:p>
@@ -168,7 +177,11 @@
         <w:pStyle w:val="BodyText"/>
       </w:pPr>
       <w:r>
-        <w:t>At the same time, review articles note that current systems still struggle with sparse rewards, partial observability, and generalization across targets [11]. Our work focuses specifically on web applications and uses these findings to motivate a compact state representation, a constrained action curriculum, and an evaluation design centered on confirmed findings rather than raw alerts.</w:t>
+        <w:t xml:space="preserve">In the domain of automated penetration testing, researchers are increasingly leveraging these bleeding-edge DRL techniques to train intelligent agents truly capable of discovering vulnerabilities at scale. Recent studies, such as the widely recognized Intelligent Automated Penetration Testing Framework (IAPTF) by Ghanem et al., have successfully utilized reinforcement learning to fully automate sequential decision-making in complex security assessments. By cleverly modeling penetration testing as a Partially Observable Markov Decision Process (POMDP), IAPTF demonstrated a profound ability to discover multi-step vulnerabilities deeply embedded in complex networks, all while effortlessly integrating with established toolkits like Metasploit [7]. Combining these principles, frameworks like ASAP merge potent Deep Q-Networks with Attack Graphs to automatically plan highly complex attack chains against expansive enterprise networks [14]. Similarly, recent groundbreaking projects such as “Pentest-R1” successfully paired massive language models with reinforcement learning to dynamically enhance the “reasoning” capabilities of automated penetration testers globally [8]. The applications aren’t even strictly limited to web and software—algorithms like “Re-Pen” have successfully ported these exact DRL methods over to verify physical hardware security, searching for </w:t>
+      </w:r>
+      <w:r>
+        <w:lastRenderedPageBreak/>
+        <w:t>exploitable flaws directly embedded inside microchip architectures [9]. To maintain adaptivity without experiencing catastrophic forgetting, frameworks like SCRIPT powerfully leverage continual reinforcement learning across dynamic networks [10]. Systematic literature reviews confirm this trend, arguing that RL is rapidly becoming indispensable for tackling infinitely expanding attack surfaces [11]. Similarly, recent comparative studies have evaluated the effectiveness of various RL algorithms—such as Deep Q-Network (DQN), Deep Deterministic Policy Gradient (DDPG), and Asynchronous Episodic DDPG (AE-DDPG)—in automating penetration testing tasks by dynamically identifying critical network vulnerabilities [15]. These “Red Team” algorithms map the manual penetration testing process to a strict Markov Decision Process (MDP), where the agent learns optimal attack sequences—or a “Kill Chain”—to cleanly navigate target environments, bypass active security controls, and exploit vulnerabilities. While existing research has strongly demonstrated the potential of DRL for network-level intrusion detection and niche web service attacks, comprehensive frameworks that address the full, complex spectrum of modern web vulnerabilities (such as the OWASP Top 10) utilizing a highly Extended Double Dueling Deep Q-Network (Extended D3QN) remain an area of intense active innovation. Our work cleanly bridges this gap by directly implementing an Extended D3QN agent paired with PER and Noisy Networks, specifically architected from the ground up for autonomous web vulnerability scanning.</w:t>
       </w:r>
     </w:p>
     <w:p>
@@ -194,7 +207,7 @@
         <w:pStyle w:val="FirstParagraph"/>
       </w:pPr>
       <w:r>
-        <w:t>The proposed framework separates agent learning from HTTP execution so that the RL policy can be improved without changing the target interaction layer. This section summarizes the system architecture, the MDP formulation, the Extended D3QN design, and the phase-based training strategy.</w:t>
+        <w:t>Our Reinforcement Learning framework is designed to completely decouple the internal AI logic from the actual HTTP execution engine. The core components include the system architecture, how we formulate vulnerability scanning as an MDP, the design of the DQN agent and its underlying mathematics, and the Phase-Based Learning progression.</w:t>
       </w:r>
     </w:p>
     <w:p>
@@ -263,7 +276,7 @@
         <w:pStyle w:val="ImageCaption"/>
       </w:pPr>
       <w:r>
-        <w:t>System architecture of the proposed RL-based web vulnerability scanner.</w:t>
+        <w:t>D3QN Vulnerability Finder Architecture</w:t>
       </w:r>
     </w:p>
     <w:p>
@@ -271,7 +284,7 @@
         <w:pStyle w:val="BodyText"/>
       </w:pPr>
       <w:r>
-        <w:t>The scanner is organized around three components. WebSecurityGym interfaces with the target application, normalizes observations, and executes payloads selected by the agent. The Extended D3QN policy estimates action values over a discrete payload space. The vulnerable mock applications provide safe training and evaluation targets that expose different vulnerability classes.</w:t>
+        <w:t>The autonomous vulnerability scanner is built upon a highly modular architecture designed specifically to decouple the AI decision-making process from the underlying HTTP execution engine. The system elegantly comprises three primary modules: the system architecture, how we formulate vulnerability scanning as an MDP, the design of the DQN agent and its underlying mathematics, and the Phase-Based Learning progression.</w:t>
       </w:r>
     </w:p>
     <w:p>
@@ -279,7 +292,7 @@
         <w:pStyle w:val="BodyText"/>
       </w:pPr>
       <w:r>
-        <w:t>The architecture in Fig. 1 supports repeated interaction loops between the target, the environment wrapper, and the RL agent.</w:t>
+        <w:t>At a high level, the system consists of three main parts:</w:t>
       </w:r>
     </w:p>
     <w:p>
@@ -291,7 +304,14 @@
         </w:numPr>
       </w:pPr>
       <w:r>
-        <w:t>Target Environment (WebSecurityGym): converts HTTP responses, response timing, and page structure into a fixed-length state vector and maps discrete actions to concrete requests.</w:t>
+        <w:rPr>
+          <w:b/>
+          <w:bCs/>
+        </w:rPr>
+        <w:t>Target Environment (WebSecurityGym)</w:t>
+      </w:r>
+      <w:r>
+        <w:t>: This acts as the translation layer. It crawls the target site, converts incoming HTTP responses into a clean numerical state vector, and translates chosen actions back into physical HTTP requests carrying various security payloads.</w:t>
       </w:r>
     </w:p>
     <w:p>
@@ -303,7 +323,15 @@
         </w:numPr>
       </w:pPr>
       <w:r>
-        <w:t>Extended D3QN Agent: combines Double Q-learning, dueling heads, prioritized replay, noisy linear layers, and multi-step returns to improve learning stability.</w:t>
+        <w:rPr>
+          <w:b/>
+          <w:bCs/>
+        </w:rPr>
+        <w:lastRenderedPageBreak/>
+        <w:t>The RL Agent (Extended D3QN)</w:t>
+      </w:r>
+      <w:r>
+        <w:t>: This acts as the “brain.” It leverages a highly extended D3QN structure incorporating key Rainbow DQN elements alongside a prioritized experience replay buffer to continuously and rapidly learn from past experiments.</w:t>
       </w:r>
     </w:p>
     <w:p>
@@ -315,7 +343,14 @@
         </w:numPr>
       </w:pPr>
       <w:r>
-        <w:t>Mock Applications: provide isolated training targets with known vulnerabilities and ground-truth labels for evaluation.</w:t>
+        <w:rPr>
+          <w:b/>
+          <w:bCs/>
+        </w:rPr>
+        <w:t>Mock Applications</w:t>
+      </w:r>
+      <w:r>
+        <w:t>: For safe training and baseline evaluations, we built multiple deliberately vulnerable web applications (such as E-commerce, Banking, and Social Media) that respond realistically to the agent’s probes.</w:t>
       </w:r>
     </w:p>
     <w:p>
@@ -333,15 +368,138 @@
         <w:pStyle w:val="FirstParagraph"/>
       </w:pPr>
       <w:r>
-        <w:t>WebSecurityGym models scanning as an MDP, M = (S, A, P, R, gamma), where each step updates the agent state after a request-response interaction.</w:t>
+        <w:t xml:space="preserve">To successfully apply RL to security, we model the interaction as a Markov Decision Process (MDP). This is defined by a tuple </w:t>
+      </w:r>
+      <m:oMath>
+        <m:r>
+          <w:rPr>
+            <w:rFonts w:ascii="Cambria Math" w:hAnsi="Cambria Math"/>
+          </w:rPr>
+          <m:t>M</m:t>
+        </m:r>
+        <m:r>
+          <m:rPr>
+            <m:scr m:val="script"/>
+            <m:sty m:val="p"/>
+          </m:rPr>
+          <w:rPr>
+            <w:rFonts w:ascii="Cambria Math" w:hAnsi="Cambria Math"/>
+          </w:rPr>
+          <m:t>=(S,A,P,R,</m:t>
+        </m:r>
+        <m:r>
+          <w:rPr>
+            <w:rFonts w:ascii="Cambria Math" w:hAnsi="Cambria Math"/>
+          </w:rPr>
+          <m:t>γ</m:t>
+        </m:r>
+        <m:r>
+          <m:rPr>
+            <m:sty m:val="p"/>
+          </m:rPr>
+          <w:rPr>
+            <w:rFonts w:ascii="Cambria Math" w:hAnsi="Cambria Math"/>
+          </w:rPr>
+          <m:t>)</m:t>
+        </m:r>
+      </m:oMath>
+      <w:r>
+        <w:t xml:space="preserve">, where </w:t>
+      </w:r>
+      <m:oMath>
+        <m:r>
+          <m:rPr>
+            <m:scr m:val="script"/>
+            <m:sty m:val="p"/>
+          </m:rPr>
+          <w:rPr>
+            <w:rFonts w:ascii="Cambria Math" w:hAnsi="Cambria Math"/>
+          </w:rPr>
+          <m:t>S</m:t>
+        </m:r>
+      </m:oMath>
+      <w:r>
+        <w:t xml:space="preserve"> represents states, </w:t>
+      </w:r>
+      <m:oMath>
+        <m:r>
+          <m:rPr>
+            <m:scr m:val="script"/>
+            <m:sty m:val="p"/>
+          </m:rPr>
+          <w:rPr>
+            <w:rFonts w:ascii="Cambria Math" w:hAnsi="Cambria Math"/>
+          </w:rPr>
+          <m:t>A</m:t>
+        </m:r>
+      </m:oMath>
+      <w:r>
+        <w:t xml:space="preserve"> actions, </w:t>
+      </w:r>
+      <m:oMath>
+        <m:r>
+          <m:rPr>
+            <m:scr m:val="script"/>
+            <m:sty m:val="p"/>
+          </m:rPr>
+          <w:rPr>
+            <w:rFonts w:ascii="Cambria Math" w:hAnsi="Cambria Math"/>
+          </w:rPr>
+          <m:t>P</m:t>
+        </m:r>
+      </m:oMath>
+      <w:r>
+        <w:t xml:space="preserve"> state transition probabilities, </w:t>
+      </w:r>
+      <m:oMath>
+        <m:r>
+          <m:rPr>
+            <m:scr m:val="script"/>
+            <m:sty m:val="p"/>
+          </m:rPr>
+          <w:rPr>
+            <w:rFonts w:ascii="Cambria Math" w:hAnsi="Cambria Math"/>
+          </w:rPr>
+          <m:t>R</m:t>
+        </m:r>
+      </m:oMath>
+      <w:r>
+        <w:t xml:space="preserve"> rewards, and </w:t>
+      </w:r>
+      <m:oMath>
+        <m:r>
+          <w:rPr>
+            <w:rFonts w:ascii="Cambria Math" w:hAnsi="Cambria Math"/>
+          </w:rPr>
+          <m:t>γ</m:t>
+        </m:r>
+      </m:oMath>
+      <w:r>
+        <w:t xml:space="preserve"> the discount factor.</w:t>
       </w:r>
     </w:p>
     <w:p>
       <w:pPr>
         <w:pStyle w:val="Heading3"/>
       </w:pPr>
-      <w:r>
-        <w:t>1) State Representation (S)</w:t>
+      <w:bookmarkStart w:id="10" w:name="state-representation-mathcals"/>
+      <w:r>
+        <w:t>1) State Representation (</w:t>
+      </w:r>
+      <m:oMath>
+        <m:r>
+          <m:rPr>
+            <m:scr m:val="script"/>
+            <m:sty m:val="p"/>
+          </m:rPr>
+          <w:rPr>
+            <w:rFonts w:ascii="Cambria Math" w:hAnsi="Cambria Math"/>
+          </w:rPr>
+          <m:t>S</m:t>
+        </m:r>
+      </m:oMath>
+      <w:r>
+        <w:t>)</w:t>
       </w:r>
     </w:p>
     <w:p>
@@ -349,7 +507,7 @@
         <w:pStyle w:val="FirstParagraph"/>
       </w:pPr>
       <w:r>
-        <w:t>The state vector summarizes features such as HTTP status, response length, latency, form discovery, input reflection, SQL error indicators, and WAF-trigger signals. This compact representation is intended to preserve action-relevant context without encoding raw page content.</w:t>
+        <w:t>The state represents the agent’s real-time understanding of the web application. To prevent the classic issue of combinatorial explosion, we condense the features into a 15-dimensional numeric vector including components like:</w:t>
       </w:r>
     </w:p>
     <w:p>
@@ -361,7 +519,14 @@
         </w:numPr>
       </w:pPr>
       <w:r>
-        <w:t>HTTP response metrics: normalized status code, content length, and timing.</w:t>
+        <w:rPr>
+          <w:b/>
+          <w:bCs/>
+        </w:rPr>
+        <w:t>HTTP Response Metrics</w:t>
+      </w:r>
+      <w:r>
+        <w:t>: Standardized HTTP status codes (e.g., 200 vs 403), precise response times, and content length variations.</w:t>
       </w:r>
     </w:p>
     <w:p>
@@ -373,7 +538,14 @@
         </w:numPr>
       </w:pPr>
       <w:r>
-        <w:t>Structural indicators: discovered forms, reflected input, and newly reachable endpoints.</w:t>
+        <w:rPr>
+          <w:b/>
+          <w:bCs/>
+        </w:rPr>
+        <w:t>Structural Indicators</w:t>
+      </w:r>
+      <w:r>
+        <w:t>: Flags indicating if the DOM reflects previous inputs, or if new actionable forms were discovered.</w:t>
       </w:r>
     </w:p>
     <w:p>
@@ -385,15 +557,39 @@
         </w:numPr>
       </w:pPr>
       <w:r>
-        <w:t>Security context: database error signatures, authorization failures, and defensive responses.</w:t>
+        <w:rPr>
+          <w:b/>
+          <w:bCs/>
+        </w:rPr>
+        <w:t>Security Context</w:t>
+      </w:r>
+      <w:r>
+        <w:t>: Identifiers indicating the presence of a Web Application Firewall (WAF) rule being triggered, or leaked SQL syntax errors.</w:t>
       </w:r>
     </w:p>
     <w:p>
       <w:pPr>
         <w:pStyle w:val="Heading3"/>
       </w:pPr>
-      <w:r>
-        <w:t>2) Action Space (A)</w:t>
+      <w:bookmarkStart w:id="11" w:name="action-space-mathcala"/>
+      <w:bookmarkEnd w:id="10"/>
+      <w:r>
+        <w:t>2) Action Space (</w:t>
+      </w:r>
+      <m:oMath>
+        <m:r>
+          <m:rPr>
+            <m:scr m:val="script"/>
+            <m:sty m:val="p"/>
+          </m:rPr>
+          <w:rPr>
+            <w:rFonts w:ascii="Cambria Math" w:hAnsi="Cambria Math"/>
+          </w:rPr>
+          <m:t>A</m:t>
+        </m:r>
+      </m:oMath>
+      <w:r>
+        <w:t>)</w:t>
       </w:r>
     </w:p>
     <w:p>
@@ -401,7 +597,7 @@
         <w:pStyle w:val="FirstParagraph"/>
       </w:pPr>
       <w:r>
-        <w:t>The action space contains 150 discrete operations grouped by scanning phase.</w:t>
+        <w:t>We employ a discrete action space of 150 distinct operations mirroring human penetration testing methodologies:</w:t>
       </w:r>
     </w:p>
     <w:p>
@@ -413,7 +609,14 @@
         </w:numPr>
       </w:pPr>
       <w:r>
-        <w:t>Reconnaissance actions: endpoint discovery, parameter enumeration, and session establishment.</w:t>
+        <w:rPr>
+          <w:b/>
+          <w:bCs/>
+        </w:rPr>
+        <w:t>Reconnaissance Actions (0-29)</w:t>
+      </w:r>
+      <w:r>
+        <w:t>: Standard directory bruteforcing and parameter enumeration.</w:t>
       </w:r>
     </w:p>
     <w:p>
@@ -425,7 +628,23 @@
         </w:numPr>
       </w:pPr>
       <w:r>
-        <w:t>Assessment actions: low-impact probes that test for anomalous behavior or reflection.</w:t>
+        <w:rPr>
+          <w:b/>
+          <w:bCs/>
+        </w:rPr>
+        <w:t>Vulnerability Assessment (30-69)</w:t>
+      </w:r>
+      <w:r>
+        <w:t xml:space="preserve">: Dropping mild payloads (like </w:t>
+      </w:r>
+      <w:r>
+        <w:rPr>
+          <w:rStyle w:val="VerbatimChar"/>
+        </w:rPr>
+        <w:t>' OR 1=1--</w:t>
+      </w:r>
+      <w:r>
+        <w:t xml:space="preserve"> or single quote marks) just to elicit an anomaly from the database or logic layer.</w:t>
       </w:r>
     </w:p>
     <w:p>
@@ -437,7 +656,14 @@
         </w:numPr>
       </w:pPr>
       <w:r>
-        <w:t>Exploitation actions: higher-risk payloads targeting vulnerabilities such as SQL injection and cross-site scripting.</w:t>
+        <w:rPr>
+          <w:b/>
+          <w:bCs/>
+        </w:rPr>
+        <w:t>Active Exploitation (70-149)</w:t>
+      </w:r>
+      <w:r>
+        <w:t>: Utilizing weaponized, complex payloads aimed directly at achieving Remote Code Execution, SQLi, or XSS.</w:t>
       </w:r>
     </w:p>
     <w:p>
@@ -456,7 +682,7 @@
         <w:pStyle w:val="FirstParagraph"/>
       </w:pPr>
       <w:r>
-        <w:t>The policy network is based on Double Dueling DQN. Standard Q-learning updates the action value estimate according to the Bellman equation:</w:t>
+        <w:t>The core intelligence of our scanner runs on a Double Dueling Deep Q-Network (D3QN). While standard Q-Learning follows the Bellman equation to iterative update action values:</w:t>
       </w:r>
     </w:p>
     <w:p>
@@ -925,7 +1151,8 @@
         <w:pStyle w:val="FirstParagraph"/>
       </w:pPr>
       <w:r>
-        <w:t>To reduce overestimation, Double DQN separates action selection from target evaluation:</w:t>
+        <w:lastRenderedPageBreak/>
+        <w:t>Classic Deep Q-Networks tend to overestimate action values. To combat this, we utilize a Double DQN formulation, separating action selection from value estimation:</w:t>
       </w:r>
     </w:p>
     <w:p>
@@ -1274,7 +1501,78 @@
         <w:pStyle w:val="FirstParagraph"/>
       </w:pPr>
       <w:r>
-        <w:t>where theta denotes the online network parameters and theta-minus denotes the target network parameters.</w:t>
+        <w:t xml:space="preserve">where </w:t>
+      </w:r>
+      <m:oMath>
+        <m:sSub>
+          <m:sSubPr>
+            <m:ctrlPr>
+              <w:rPr>
+                <w:rFonts w:ascii="Cambria Math" w:hAnsi="Cambria Math"/>
+              </w:rPr>
+            </m:ctrlPr>
+          </m:sSubPr>
+          <m:e>
+            <m:r>
+              <w:rPr>
+                <w:rFonts w:ascii="Cambria Math" w:hAnsi="Cambria Math"/>
+              </w:rPr>
+              <m:t>θ</m:t>
+            </m:r>
+          </m:e>
+          <m:sub>
+            <m:r>
+              <w:rPr>
+                <w:rFonts w:ascii="Cambria Math" w:hAnsi="Cambria Math"/>
+              </w:rPr>
+              <m:t>t</m:t>
+            </m:r>
+          </m:sub>
+        </m:sSub>
+      </m:oMath>
+      <w:r>
+        <w:t xml:space="preserve"> represents the parameters of the primary network and </w:t>
+      </w:r>
+      <m:oMath>
+        <m:sSubSup>
+          <m:sSubSupPr>
+            <m:ctrlPr>
+              <w:rPr>
+                <w:rFonts w:ascii="Cambria Math" w:hAnsi="Cambria Math"/>
+              </w:rPr>
+            </m:ctrlPr>
+          </m:sSubSupPr>
+          <m:e>
+            <m:r>
+              <w:rPr>
+                <w:rFonts w:ascii="Cambria Math" w:hAnsi="Cambria Math"/>
+              </w:rPr>
+              <m:t>θ</m:t>
+            </m:r>
+          </m:e>
+          <m:sub>
+            <m:r>
+              <w:rPr>
+                <w:rFonts w:ascii="Cambria Math" w:hAnsi="Cambria Math"/>
+              </w:rPr>
+              <m:t>t</m:t>
+            </m:r>
+          </m:sub>
+          <m:sup>
+            <m:r>
+              <m:rPr>
+                <m:sty m:val="p"/>
+              </m:rPr>
+              <w:rPr>
+                <w:rFonts w:ascii="Cambria Math" w:hAnsi="Cambria Math"/>
+              </w:rPr>
+              <m:t>-</m:t>
+            </m:r>
+          </m:sup>
+        </m:sSubSup>
+      </m:oMath>
+      <w:r>
+        <w:t xml:space="preserve"> represents the target network parameters.</w:t>
       </w:r>
     </w:p>
     <w:p>
@@ -1282,7 +1580,102 @@
         <w:pStyle w:val="BodyText"/>
       </w:pPr>
       <w:r>
-        <w:t>A dueling architecture then decomposes state value and action advantage so that the agent can distinguish promising states from the relative quality of candidate actions.</w:t>
+        <w:t xml:space="preserve">To further improve sample efficiency when evaluating the 150-dimensional action space, we employ a </w:t>
+      </w:r>
+      <w:r>
+        <w:rPr>
+          <w:b/>
+          <w:bCs/>
+        </w:rPr>
+        <w:t>Dueling Network Architecture</w:t>
+      </w:r>
+      <w:r>
+        <w:t xml:space="preserve">. This explicitly separates the inherent value of being in a state </w:t>
+      </w:r>
+      <m:oMath>
+        <m:r>
+          <w:rPr>
+            <w:rFonts w:ascii="Cambria Math" w:hAnsi="Cambria Math"/>
+          </w:rPr>
+          <m:t>V</m:t>
+        </m:r>
+        <m:r>
+          <m:rPr>
+            <m:sty m:val="p"/>
+          </m:rPr>
+          <w:rPr>
+            <w:rFonts w:ascii="Cambria Math" w:hAnsi="Cambria Math"/>
+          </w:rPr>
+          <m:t>(</m:t>
+        </m:r>
+        <m:r>
+          <w:rPr>
+            <w:rFonts w:ascii="Cambria Math" w:hAnsi="Cambria Math"/>
+          </w:rPr>
+          <m:t>s</m:t>
+        </m:r>
+        <m:r>
+          <m:rPr>
+            <m:sty m:val="p"/>
+          </m:rPr>
+          <w:rPr>
+            <w:rFonts w:ascii="Cambria Math" w:hAnsi="Cambria Math"/>
+          </w:rPr>
+          <m:t>)</m:t>
+        </m:r>
+      </m:oMath>
+      <w:r>
+        <w:t xml:space="preserve"> from the specific advantage of taking an action </w:t>
+      </w:r>
+      <m:oMath>
+        <m:r>
+          <w:rPr>
+            <w:rFonts w:ascii="Cambria Math" w:hAnsi="Cambria Math"/>
+          </w:rPr>
+          <m:t>A</m:t>
+        </m:r>
+        <m:r>
+          <m:rPr>
+            <m:sty m:val="p"/>
+          </m:rPr>
+          <w:rPr>
+            <w:rFonts w:ascii="Cambria Math" w:hAnsi="Cambria Math"/>
+          </w:rPr>
+          <m:t>(</m:t>
+        </m:r>
+        <m:r>
+          <w:rPr>
+            <w:rFonts w:ascii="Cambria Math" w:hAnsi="Cambria Math"/>
+          </w:rPr>
+          <m:t>s</m:t>
+        </m:r>
+        <m:r>
+          <m:rPr>
+            <m:sty m:val="p"/>
+          </m:rPr>
+          <w:rPr>
+            <w:rFonts w:ascii="Cambria Math" w:hAnsi="Cambria Math"/>
+          </w:rPr>
+          <m:t>,</m:t>
+        </m:r>
+        <m:r>
+          <w:rPr>
+            <w:rFonts w:ascii="Cambria Math" w:hAnsi="Cambria Math"/>
+          </w:rPr>
+          <m:t>a</m:t>
+        </m:r>
+        <m:r>
+          <m:rPr>
+            <m:sty m:val="p"/>
+          </m:rPr>
+          <w:rPr>
+            <w:rFonts w:ascii="Cambria Math" w:hAnsi="Cambria Math"/>
+          </w:rPr>
+          <m:t>)</m:t>
+        </m:r>
+      </m:oMath>
+      <w:r>
+        <w:t>. The resulting Q-value is estimated as:</w:t>
       </w:r>
     </w:p>
     <w:p>
@@ -1701,7 +2094,7 @@
         <w:pStyle w:val="FirstParagraph"/>
       </w:pPr>
       <w:r>
-        <w:t>Subtracting the mean advantage stabilizes training by constraining the decomposition.</w:t>
+        <w:t>By subtracting the mean advantage, the network forces the advantage stream to have zero mean, which significantly stabilizes mathematical convergence during training.</w:t>
       </w:r>
     </w:p>
     <w:p>
@@ -1709,15 +2102,107 @@
         <w:pStyle w:val="BodyText"/>
       </w:pPr>
       <w:r>
-        <w:t>The model is extended with prioritized experience replay, noisy exploration, and multi-step returns. Together, these components improve sample reuse, reduce dependence on manual epsilon scheduling, and accelerate reward propagation from delayed outcomes.</w:t>
+        <w:t xml:space="preserve">Furthermore, this baseline D3QN architecture is significantly upgraded into an </w:t>
+      </w:r>
+      <w:r>
+        <w:rPr>
+          <w:b/>
+          <w:bCs/>
+        </w:rPr>
+        <w:t>Extended D3QN</w:t>
+      </w:r>
+      <w:r>
+        <w:t xml:space="preserve">, incorporating five of the six core extensions from the </w:t>
+      </w:r>
+      <w:r>
+        <w:rPr>
+          <w:b/>
+          <w:bCs/>
+        </w:rPr>
+        <w:t>Rainbow DQN</w:t>
+      </w:r>
+      <w:r>
+        <w:t xml:space="preserve"> algorithm (lacking Distributional RL). By integrating </w:t>
+      </w:r>
+      <w:r>
+        <w:rPr>
+          <w:b/>
+          <w:bCs/>
+        </w:rPr>
+        <w:t>Prioritized Experience Replay (PER)</w:t>
+      </w:r>
+      <w:r>
+        <w:t xml:space="preserve">, the agent samples highly surprising transitions (those with large Temporal Difference error) more frequently, accelerating convergence. Substituting </w:t>
+      </w:r>
+      <m:oMath>
+        <m:r>
+          <w:rPr>
+            <w:rFonts w:ascii="Cambria Math" w:hAnsi="Cambria Math"/>
+          </w:rPr>
+          <m:t>ϵ</m:t>
+        </m:r>
+      </m:oMath>
+      <w:r>
+        <w:t xml:space="preserve">-greedy exploration with </w:t>
+      </w:r>
+      <w:r>
+        <w:rPr>
+          <w:b/>
+          <w:bCs/>
+        </w:rPr>
+        <w:t>Noisy Networks</w:t>
+      </w:r>
+      <w:r>
+        <w:t xml:space="preserve"> adds parametric noise directly into the network weights, driving highly systematic exploration of the target application rather than relying on pure chance. Finally, the inclusion of </w:t>
+      </w:r>
+      <w:r>
+        <w:rPr>
+          <w:b/>
+          <w:bCs/>
+        </w:rPr>
+        <w:t>Multi-Step Learning (</w:t>
+      </w:r>
+      <m:oMath>
+        <m:r>
+          <w:rPr>
+            <w:rFonts w:ascii="Cambria Math" w:hAnsi="Cambria Math"/>
+          </w:rPr>
+          <m:t>n</m:t>
+        </m:r>
+      </m:oMath>
+      <w:r>
+        <w:rPr>
+          <w:b/>
+          <w:bCs/>
+        </w:rPr>
+        <w:t>-step returns)</w:t>
+      </w:r>
+      <w:r>
+        <w:t xml:space="preserve"> bridges the gap between TD learning and Monte Carlo methods, accelerating the propagation of delayed rewards from multi-step exploits.</w:t>
       </w:r>
     </w:p>
     <w:p>
       <w:pPr>
         <w:pStyle w:val="Heading3"/>
       </w:pPr>
-      <w:r>
-        <w:t>1) Reward Function (R)</w:t>
+      <w:bookmarkStart w:id="13" w:name="reward-function-mathcalr"/>
+      <w:r>
+        <w:t>1) Reward Function (</w:t>
+      </w:r>
+      <m:oMath>
+        <m:r>
+          <m:rPr>
+            <m:scr m:val="script"/>
+            <m:sty m:val="p"/>
+          </m:rPr>
+          <w:rPr>
+            <w:rFonts w:ascii="Cambria Math" w:hAnsi="Cambria Math"/>
+          </w:rPr>
+          <m:t>R</m:t>
+        </m:r>
+      </m:oMath>
+      <w:r>
+        <w:t>)</w:t>
       </w:r>
     </w:p>
     <w:p>
@@ -1725,7 +2210,7 @@
         <w:pStyle w:val="FirstParagraph"/>
       </w:pPr>
       <w:r>
-        <w:t>The reward function favors verifiable progress while penalizing inefficient or blocked behavior.</w:t>
+        <w:t>To train the agent effectively, the reward function is highly shaped:</w:t>
       </w:r>
     </w:p>
     <w:p>
@@ -1737,7 +2222,54 @@
         </w:numPr>
       </w:pPr>
       <w:r>
-        <w:t>Positive rewards are assigned when the agent triggers a confirmed vulnerability condition or reaches a high-value milestone such as flag capture in controlled scenarios.</w:t>
+        <w:rPr>
+          <w:b/>
+          <w:bCs/>
+        </w:rPr>
+        <w:t>Positive Reinforcement</w:t>
+      </w:r>
+      <w:r>
+        <w:t xml:space="preserve">: Discovering a verifiable vulnerability yields </w:t>
+      </w:r>
+      <m:oMath>
+        <m:r>
+          <m:rPr>
+            <m:sty m:val="p"/>
+          </m:rPr>
+          <w:rPr>
+            <w:rFonts w:ascii="Cambria Math" w:hAnsi="Cambria Math"/>
+          </w:rPr>
+          <m:t>+</m:t>
+        </m:r>
+        <m:r>
+          <w:rPr>
+            <w:rFonts w:ascii="Cambria Math" w:hAnsi="Cambria Math"/>
+          </w:rPr>
+          <m:t>1.0</m:t>
+        </m:r>
+      </m:oMath>
+      <w:r>
+        <w:t xml:space="preserve">. Capturing hidden CTF flags (indicating deep system compromise) yields </w:t>
+      </w:r>
+      <m:oMath>
+        <m:r>
+          <m:rPr>
+            <m:sty m:val="p"/>
+          </m:rPr>
+          <w:rPr>
+            <w:rFonts w:ascii="Cambria Math" w:hAnsi="Cambria Math"/>
+          </w:rPr>
+          <m:t>+</m:t>
+        </m:r>
+        <m:r>
+          <w:rPr>
+            <w:rFonts w:ascii="Cambria Math" w:hAnsi="Cambria Math"/>
+          </w:rPr>
+          <m:t>5.0</m:t>
+        </m:r>
+      </m:oMath>
+      <w:r>
+        <w:t>.</w:t>
       </w:r>
     </w:p>
     <w:p>
@@ -1749,7 +2281,54 @@
         </w:numPr>
       </w:pPr>
       <w:r>
-        <w:t>Small step penalties encourage shorter attack chains, while stronger negative rewards discourage rate limits, WAF blocks, and other noisy behavior.</w:t>
+        <w:rPr>
+          <w:b/>
+          <w:bCs/>
+        </w:rPr>
+        <w:t>Negative Penalties</w:t>
+      </w:r>
+      <w:r>
+        <w:t>: Small step penalties (</w:t>
+      </w:r>
+      <m:oMath>
+        <m:r>
+          <m:rPr>
+            <m:sty m:val="p"/>
+          </m:rPr>
+          <w:rPr>
+            <w:rFonts w:ascii="Cambria Math" w:hAnsi="Cambria Math"/>
+          </w:rPr>
+          <m:t>-</m:t>
+        </m:r>
+        <m:r>
+          <w:rPr>
+            <w:rFonts w:ascii="Cambria Math" w:hAnsi="Cambria Math"/>
+          </w:rPr>
+          <m:t>0.01</m:t>
+        </m:r>
+      </m:oMath>
+      <w:r>
+        <w:t>) encourage efficiency. Triggering a firewall block or rate limit results in a massive penalty (</w:t>
+      </w:r>
+      <m:oMath>
+        <m:r>
+          <m:rPr>
+            <m:sty m:val="p"/>
+          </m:rPr>
+          <w:rPr>
+            <w:rFonts w:ascii="Cambria Math" w:hAnsi="Cambria Math"/>
+          </w:rPr>
+          <m:t>-</m:t>
+        </m:r>
+        <m:r>
+          <w:rPr>
+            <w:rFonts w:ascii="Cambria Math" w:hAnsi="Cambria Math"/>
+          </w:rPr>
+          <m:t>0.1</m:t>
+        </m:r>
+      </m:oMath>
+      <w:r>
+        <w:t>), forcing the agent to learn stealth and avoid noisy bruteforcing.</w:t>
       </w:r>
     </w:p>
     <w:p>
@@ -1767,12 +2346,832 @@
         <w:pStyle w:val="FirstParagraph"/>
       </w:pPr>
       <w:r>
-        <w:t>Training follows a phase-based curriculum. The agent begins with reconnaissance actions only, then unlocks assessment and exploitation actions after sustained reward improvement. This reduces unproductive exploration early in training and encourages the policy to build context before attempting high-impact payloads.</w:t>
-      </w:r>
-    </w:p>
-    <w:p>
-      <w:r>
-        <w:t>In each episode, the environment is reset, the agent selects an action from the currently unlocked phase, the transition is stored in replay memory, the online network is updated from mini-batches, and the target network is synchronized periodically.</w:t>
+        <w:t>To stabilize learning and prevent the agent from indiscriminately firing complex exploits before understanding the target surface area, we implement a phase-based curriculum. Algorithm 1 illustrates the overall simulated penetration testing loop:</w:t>
+      </w:r>
+    </w:p>
+    <w:tbl>
+      <w:tblPr>
+        <w:tblStyle w:val="TableGrid"/>
+        <w:tblW w:w="5000" w:type="pct"/>
+        <w:tblBorders>
+          <w:top w:val="none" w:sz="0" w:space="0" w:color="auto"/>
+          <w:left w:val="none" w:sz="0" w:space="0" w:color="auto"/>
+          <w:bottom w:val="none" w:sz="0" w:space="0" w:color="auto"/>
+          <w:right w:val="none" w:sz="0" w:space="0" w:color="auto"/>
+          <w:insideH w:val="none" w:sz="0" w:space="0" w:color="auto"/>
+          <w:insideV w:val="none" w:sz="0" w:space="0" w:color="auto"/>
+        </w:tblBorders>
+        <w:tblLook w:val="0420" w:firstRow="1" w:lastRow="0" w:firstColumn="0" w:lastColumn="0" w:noHBand="0" w:noVBand="1"/>
+      </w:tblPr>
+      <w:tblGrid>
+        <w:gridCol w:w="648"/>
+        <w:gridCol w:w="8461"/>
+        <w:gridCol w:w="467"/>
+      </w:tblGrid>
+      <w:tr>
+        <w:trPr>
+          <w:gridAfter w:val="1"/>
+          <w:wAfter w:w="244" w:type="pct"/>
+        </w:trPr>
+        <w:tc>
+          <w:tcPr>
+            <w:tcW w:w="4756" w:type="pct"/>
+            <w:gridSpan w:val="2"/>
+            <w:tcBorders>
+              <w:top w:val="single" w:sz="4" w:space="0" w:color="auto"/>
+            </w:tcBorders>
+          </w:tcPr>
+          <w:p>
+            <w:pPr>
+              <w:pStyle w:val="AbstractTitle"/>
+              <w:jc w:val="left"/>
+              <w:rPr>
+                <w:rFonts w:ascii="Times New Roman" w:hAnsi="Times New Roman" w:cs="Times New Roman"/>
+                <w:sz w:val="30"/>
+                <w:szCs w:val="30"/>
+              </w:rPr>
+            </w:pPr>
+            <w:r>
+              <w:rPr>
+                <w:rFonts w:ascii="Times New Roman" w:hAnsi="Times New Roman" w:cs="Times New Roman"/>
+                <w:sz w:val="30"/>
+                <w:szCs w:val="30"/>
+              </w:rPr>
+              <w:lastRenderedPageBreak/>
+              <w:t>Algorithm 1: Phase-Based Extended D3QN Training Process</w:t>
+            </w:r>
+          </w:p>
+          <w:p>
+            <w:pPr>
+              <w:pStyle w:val="BodyText"/>
+            </w:pPr>
+          </w:p>
+        </w:tc>
+      </w:tr>
+      <w:tr>
+        <w:trPr>
+          <w:trHeight w:val="8640"/>
+        </w:trPr>
+        <w:tc>
+          <w:tcPr>
+            <w:tcW w:w="338" w:type="pct"/>
+            <w:shd w:val="clear" w:color="auto" w:fill="FFFFFF" w:themeFill="background1"/>
+          </w:tcPr>
+          <w:p>
+            <w:pPr>
+              <w:pStyle w:val="SourceCode"/>
+              <w:rPr>
+                <w:rStyle w:val="VerbatimChar"/>
+              </w:rPr>
+            </w:pPr>
+            <w:r>
+              <w:rPr>
+                <w:rStyle w:val="VerbatimChar"/>
+              </w:rPr>
+              <w:t>1:</w:t>
+            </w:r>
+          </w:p>
+          <w:p>
+            <w:pPr>
+              <w:pStyle w:val="SourceCode"/>
+              <w:rPr>
+                <w:rStyle w:val="VerbatimChar"/>
+              </w:rPr>
+            </w:pPr>
+            <w:r>
+              <w:rPr>
+                <w:rStyle w:val="VerbatimChar"/>
+              </w:rPr>
+              <w:t>2:</w:t>
+            </w:r>
+          </w:p>
+          <w:p>
+            <w:pPr>
+              <w:pStyle w:val="SourceCode"/>
+              <w:rPr>
+                <w:rStyle w:val="VerbatimChar"/>
+              </w:rPr>
+            </w:pPr>
+            <w:r>
+              <w:rPr>
+                <w:rStyle w:val="VerbatimChar"/>
+              </w:rPr>
+              <w:t>3:</w:t>
+            </w:r>
+          </w:p>
+          <w:p>
+            <w:pPr>
+              <w:pStyle w:val="SourceCode"/>
+              <w:rPr>
+                <w:rStyle w:val="VerbatimChar"/>
+              </w:rPr>
+            </w:pPr>
+            <w:r>
+              <w:rPr>
+                <w:rStyle w:val="VerbatimChar"/>
+              </w:rPr>
+              <w:t>4:</w:t>
+            </w:r>
+          </w:p>
+          <w:p>
+            <w:pPr>
+              <w:pStyle w:val="SourceCode"/>
+              <w:rPr>
+                <w:rStyle w:val="VerbatimChar"/>
+              </w:rPr>
+            </w:pPr>
+          </w:p>
+          <w:p>
+            <w:pPr>
+              <w:pStyle w:val="SourceCode"/>
+              <w:rPr>
+                <w:rStyle w:val="VerbatimChar"/>
+              </w:rPr>
+            </w:pPr>
+            <w:r>
+              <w:rPr>
+                <w:rStyle w:val="VerbatimChar"/>
+              </w:rPr>
+              <w:t>5:</w:t>
+            </w:r>
+          </w:p>
+          <w:p>
+            <w:pPr>
+              <w:pStyle w:val="SourceCode"/>
+              <w:rPr>
+                <w:rStyle w:val="VerbatimChar"/>
+              </w:rPr>
+            </w:pPr>
+            <w:r>
+              <w:rPr>
+                <w:rStyle w:val="VerbatimChar"/>
+              </w:rPr>
+              <w:t>6:</w:t>
+            </w:r>
+          </w:p>
+          <w:p>
+            <w:pPr>
+              <w:pStyle w:val="SourceCode"/>
+              <w:rPr>
+                <w:rStyle w:val="VerbatimChar"/>
+              </w:rPr>
+            </w:pPr>
+            <w:r>
+              <w:rPr>
+                <w:rStyle w:val="VerbatimChar"/>
+              </w:rPr>
+              <w:t>7:</w:t>
+            </w:r>
+          </w:p>
+          <w:p>
+            <w:pPr>
+              <w:pStyle w:val="SourceCode"/>
+              <w:rPr>
+                <w:rStyle w:val="VerbatimChar"/>
+              </w:rPr>
+            </w:pPr>
+          </w:p>
+          <w:p>
+            <w:pPr>
+              <w:pStyle w:val="SourceCode"/>
+              <w:rPr>
+                <w:rStyle w:val="VerbatimChar"/>
+              </w:rPr>
+            </w:pPr>
+            <w:r>
+              <w:rPr>
+                <w:rStyle w:val="VerbatimChar"/>
+              </w:rPr>
+              <w:t>8:</w:t>
+            </w:r>
+          </w:p>
+          <w:p>
+            <w:pPr>
+              <w:pStyle w:val="SourceCode"/>
+              <w:rPr>
+                <w:rStyle w:val="VerbatimChar"/>
+              </w:rPr>
+            </w:pPr>
+            <w:r>
+              <w:rPr>
+                <w:rStyle w:val="VerbatimChar"/>
+              </w:rPr>
+              <w:t>9:</w:t>
+            </w:r>
+          </w:p>
+          <w:p>
+            <w:pPr>
+              <w:pStyle w:val="SourceCode"/>
+              <w:rPr>
+                <w:rStyle w:val="VerbatimChar"/>
+              </w:rPr>
+            </w:pPr>
+          </w:p>
+          <w:p>
+            <w:pPr>
+              <w:pStyle w:val="SourceCode"/>
+              <w:rPr>
+                <w:rStyle w:val="VerbatimChar"/>
+              </w:rPr>
+            </w:pPr>
+            <w:r>
+              <w:rPr>
+                <w:rStyle w:val="VerbatimChar"/>
+              </w:rPr>
+              <w:t>10:</w:t>
+            </w:r>
+          </w:p>
+          <w:p>
+            <w:pPr>
+              <w:pStyle w:val="SourceCode"/>
+              <w:rPr>
+                <w:rStyle w:val="VerbatimChar"/>
+              </w:rPr>
+            </w:pPr>
+          </w:p>
+          <w:p>
+            <w:pPr>
+              <w:pStyle w:val="SourceCode"/>
+              <w:rPr>
+                <w:rStyle w:val="VerbatimChar"/>
+              </w:rPr>
+            </w:pPr>
+            <w:r>
+              <w:rPr>
+                <w:rStyle w:val="VerbatimChar"/>
+              </w:rPr>
+              <w:t>11:</w:t>
+            </w:r>
+          </w:p>
+          <w:p>
+            <w:pPr>
+              <w:pStyle w:val="SourceCode"/>
+              <w:rPr>
+                <w:rStyle w:val="VerbatimChar"/>
+              </w:rPr>
+            </w:pPr>
+            <w:r>
+              <w:rPr>
+                <w:rStyle w:val="VerbatimChar"/>
+              </w:rPr>
+              <w:t>12:</w:t>
+            </w:r>
+          </w:p>
+          <w:p>
+            <w:pPr>
+              <w:pStyle w:val="SourceCode"/>
+              <w:rPr>
+                <w:rStyle w:val="VerbatimChar"/>
+              </w:rPr>
+            </w:pPr>
+          </w:p>
+          <w:p>
+            <w:pPr>
+              <w:pStyle w:val="SourceCode"/>
+              <w:rPr>
+                <w:rStyle w:val="VerbatimChar"/>
+              </w:rPr>
+            </w:pPr>
+          </w:p>
+          <w:p>
+            <w:pPr>
+              <w:pStyle w:val="SourceCode"/>
+              <w:rPr>
+                <w:rStyle w:val="VerbatimChar"/>
+              </w:rPr>
+            </w:pPr>
+            <w:r>
+              <w:rPr>
+                <w:rStyle w:val="VerbatimChar"/>
+              </w:rPr>
+              <w:t>13:</w:t>
+            </w:r>
+          </w:p>
+          <w:p>
+            <w:pPr>
+              <w:pStyle w:val="SourceCode"/>
+              <w:rPr>
+                <w:rStyle w:val="VerbatimChar"/>
+              </w:rPr>
+            </w:pPr>
+          </w:p>
+          <w:p>
+            <w:pPr>
+              <w:pStyle w:val="SourceCode"/>
+              <w:rPr>
+                <w:rStyle w:val="VerbatimChar"/>
+              </w:rPr>
+            </w:pPr>
+            <w:r>
+              <w:rPr>
+                <w:rStyle w:val="VerbatimChar"/>
+              </w:rPr>
+              <w:t>14:</w:t>
+            </w:r>
+          </w:p>
+          <w:p>
+            <w:pPr>
+              <w:pStyle w:val="SourceCode"/>
+              <w:rPr>
+                <w:rStyle w:val="VerbatimChar"/>
+              </w:rPr>
+            </w:pPr>
+            <w:r>
+              <w:rPr>
+                <w:rStyle w:val="VerbatimChar"/>
+              </w:rPr>
+              <w:t>15:</w:t>
+            </w:r>
+          </w:p>
+          <w:p>
+            <w:pPr>
+              <w:pStyle w:val="SourceCode"/>
+              <w:rPr>
+                <w:rStyle w:val="VerbatimChar"/>
+              </w:rPr>
+            </w:pPr>
+            <w:r>
+              <w:rPr>
+                <w:rStyle w:val="VerbatimChar"/>
+              </w:rPr>
+              <w:t>16:</w:t>
+            </w:r>
+          </w:p>
+          <w:p>
+            <w:pPr>
+              <w:pStyle w:val="SourceCode"/>
+              <w:rPr>
+                <w:rStyle w:val="VerbatimChar"/>
+              </w:rPr>
+            </w:pPr>
+            <w:r>
+              <w:rPr>
+                <w:rStyle w:val="VerbatimChar"/>
+              </w:rPr>
+              <w:t>17:</w:t>
+            </w:r>
+          </w:p>
+          <w:p>
+            <w:pPr>
+              <w:pStyle w:val="SourceCode"/>
+              <w:rPr>
+                <w:rStyle w:val="VerbatimChar"/>
+              </w:rPr>
+            </w:pPr>
+          </w:p>
+          <w:p>
+            <w:pPr>
+              <w:pStyle w:val="SourceCode"/>
+              <w:rPr>
+                <w:rStyle w:val="VerbatimChar"/>
+              </w:rPr>
+            </w:pPr>
+          </w:p>
+          <w:p>
+            <w:pPr>
+              <w:pStyle w:val="SourceCode"/>
+              <w:rPr>
+                <w:rStyle w:val="VerbatimChar"/>
+              </w:rPr>
+            </w:pPr>
+            <w:r>
+              <w:rPr>
+                <w:rStyle w:val="VerbatimChar"/>
+              </w:rPr>
+              <w:t>18:</w:t>
+            </w:r>
+          </w:p>
+          <w:p>
+            <w:pPr>
+              <w:pStyle w:val="SourceCode"/>
+              <w:rPr>
+                <w:rStyle w:val="VerbatimChar"/>
+              </w:rPr>
+            </w:pPr>
+          </w:p>
+          <w:p>
+            <w:pPr>
+              <w:pStyle w:val="SourceCode"/>
+              <w:rPr>
+                <w:rStyle w:val="VerbatimChar"/>
+              </w:rPr>
+            </w:pPr>
+            <w:r>
+              <w:rPr>
+                <w:rStyle w:val="VerbatimChar"/>
+              </w:rPr>
+              <w:t>19:</w:t>
+            </w:r>
+          </w:p>
+          <w:p>
+            <w:pPr>
+              <w:pStyle w:val="SourceCode"/>
+              <w:rPr>
+                <w:rStyle w:val="VerbatimChar"/>
+              </w:rPr>
+            </w:pPr>
+            <w:r>
+              <w:rPr>
+                <w:rStyle w:val="VerbatimChar"/>
+              </w:rPr>
+              <w:t>20:</w:t>
+            </w:r>
+          </w:p>
+          <w:p>
+            <w:pPr>
+              <w:pStyle w:val="SourceCode"/>
+              <w:rPr>
+                <w:rStyle w:val="VerbatimChar"/>
+              </w:rPr>
+            </w:pPr>
+          </w:p>
+          <w:p>
+            <w:pPr>
+              <w:pStyle w:val="SourceCode"/>
+              <w:rPr>
+                <w:rStyle w:val="VerbatimChar"/>
+              </w:rPr>
+            </w:pPr>
+            <w:r>
+              <w:rPr>
+                <w:rStyle w:val="VerbatimChar"/>
+              </w:rPr>
+              <w:t>21:</w:t>
+            </w:r>
+          </w:p>
+          <w:p>
+            <w:pPr>
+              <w:pStyle w:val="SourceCode"/>
+              <w:rPr>
+                <w:rStyle w:val="VerbatimChar"/>
+              </w:rPr>
+            </w:pPr>
+            <w:r>
+              <w:rPr>
+                <w:rStyle w:val="VerbatimChar"/>
+              </w:rPr>
+              <w:t>22:</w:t>
+            </w:r>
+          </w:p>
+          <w:p>
+            <w:pPr>
+              <w:pStyle w:val="SourceCode"/>
+              <w:rPr>
+                <w:rStyle w:val="VerbatimChar"/>
+              </w:rPr>
+            </w:pPr>
+          </w:p>
+          <w:p>
+            <w:pPr>
+              <w:pStyle w:val="SourceCode"/>
+              <w:rPr>
+                <w:rStyle w:val="VerbatimChar"/>
+              </w:rPr>
+            </w:pPr>
+            <w:r>
+              <w:rPr>
+                <w:rStyle w:val="VerbatimChar"/>
+              </w:rPr>
+              <w:t>23:</w:t>
+            </w:r>
+          </w:p>
+          <w:p>
+            <w:pPr>
+              <w:pStyle w:val="SourceCode"/>
+              <w:rPr>
+                <w:rStyle w:val="VerbatimChar"/>
+              </w:rPr>
+            </w:pPr>
+            <w:r>
+              <w:rPr>
+                <w:rStyle w:val="VerbatimChar"/>
+              </w:rPr>
+              <w:t>24:</w:t>
+            </w:r>
+          </w:p>
+          <w:p>
+            <w:pPr>
+              <w:pStyle w:val="SourceCode"/>
+              <w:rPr>
+                <w:rStyle w:val="VerbatimChar"/>
+              </w:rPr>
+            </w:pPr>
+          </w:p>
+          <w:p>
+            <w:pPr>
+              <w:pStyle w:val="SourceCode"/>
+              <w:rPr>
+                <w:rStyle w:val="VerbatimChar"/>
+              </w:rPr>
+            </w:pPr>
+            <w:r>
+              <w:rPr>
+                <w:rStyle w:val="VerbatimChar"/>
+              </w:rPr>
+              <w:t>25:26:</w:t>
+            </w:r>
+          </w:p>
+          <w:p>
+            <w:pPr>
+              <w:pStyle w:val="SourceCode"/>
+              <w:rPr>
+                <w:rStyle w:val="VerbatimChar"/>
+              </w:rPr>
+            </w:pPr>
+          </w:p>
+          <w:p>
+            <w:pPr>
+              <w:pStyle w:val="SourceCode"/>
+              <w:rPr>
+                <w:rStyle w:val="VerbatimChar"/>
+              </w:rPr>
+            </w:pPr>
+          </w:p>
+          <w:p>
+            <w:pPr>
+              <w:pStyle w:val="SourceCode"/>
+              <w:rPr>
+                <w:rStyle w:val="VerbatimChar"/>
+              </w:rPr>
+            </w:pPr>
+          </w:p>
+        </w:tc>
+        <w:tc>
+          <w:tcPr>
+            <w:tcW w:w="4662" w:type="pct"/>
+            <w:gridSpan w:val="2"/>
+          </w:tcPr>
+          <w:p>
+            <w:pPr>
+              <w:pStyle w:val="SourceCode"/>
+            </w:pPr>
+            <w:r>
+              <w:rPr>
+                <w:rStyle w:val="VerbatimChar"/>
+              </w:rPr>
+              <w:t>Initialize replay buffer D to capacity N</w:t>
+            </w:r>
+            <w:r>
+              <w:br/>
+            </w:r>
+            <w:r>
+              <w:rPr>
+                <w:rStyle w:val="VerbatimChar"/>
+              </w:rPr>
+              <w:t>Initialize primary action-value network Q with random weights θ</w:t>
+            </w:r>
+            <w:r>
+              <w:br/>
+            </w:r>
+            <w:r>
+              <w:rPr>
+                <w:rStyle w:val="VerbatimChar"/>
+              </w:rPr>
+              <w:t>Initialize target action-value network Q' with weights θ' = θ</w:t>
+            </w:r>
+            <w:r>
+              <w:br/>
+            </w:r>
+            <w:r>
+              <w:rPr>
+                <w:rStyle w:val="VerbatimChar"/>
+              </w:rPr>
+              <w:t>Initialize Phase = 0 (Reconnaissance)</w:t>
+            </w:r>
+            <w:r>
+              <w:br/>
+            </w:r>
+            <w:r>
+              <w:br/>
+            </w:r>
+            <w:r>
+              <w:rPr>
+                <w:rStyle w:val="VerbatimChar"/>
+              </w:rPr>
+              <w:t>For episode = 1 to M do</w:t>
+            </w:r>
+            <w:r>
+              <w:br/>
+            </w:r>
+            <w:r>
+              <w:rPr>
+                <w:rStyle w:val="VerbatimChar"/>
+              </w:rPr>
+              <w:t xml:space="preserve">    Reset WebSecurityGym Environment</w:t>
+            </w:r>
+            <w:r>
+              <w:br/>
+            </w:r>
+            <w:r>
+              <w:rPr>
+                <w:rStyle w:val="VerbatimChar"/>
+              </w:rPr>
+              <w:t xml:space="preserve">    Observe initial HTTP state s_1</w:t>
+            </w:r>
+            <w:r>
+              <w:br/>
+            </w:r>
+            <w:r>
+              <w:br/>
+            </w:r>
+            <w:r>
+              <w:rPr>
+                <w:rStyle w:val="VerbatimChar"/>
+              </w:rPr>
+              <w:t xml:space="preserve">    For step t = 1 to T do</w:t>
+            </w:r>
+            <w:r>
+              <w:br/>
+            </w:r>
+            <w:r>
+              <w:rPr>
+                <w:rStyle w:val="VerbatimChar"/>
+              </w:rPr>
+              <w:t xml:space="preserve">        With probability ε, select random action a_t from allowed Phase actions</w:t>
+            </w:r>
+            <w:r>
+              <w:br/>
+            </w:r>
+            <w:r>
+              <w:rPr>
+                <w:rStyle w:val="VerbatimChar"/>
+              </w:rPr>
+              <w:t xml:space="preserve">        Otherwise, select a_t = argmax_a Q(s_t, a; θ)</w:t>
+            </w:r>
+            <w:r>
+              <w:br/>
+            </w:r>
+            <w:r>
+              <w:br/>
+            </w:r>
+            <w:r>
+              <w:rPr>
+                <w:rStyle w:val="VerbatimChar"/>
+              </w:rPr>
+              <w:t xml:space="preserve">        Execute payload/action a_t against target endpoints</w:t>
+            </w:r>
+            <w:r>
+              <w:br/>
+            </w:r>
+            <w:r>
+              <w:rPr>
+                <w:rStyle w:val="VerbatimChar"/>
+              </w:rPr>
+              <w:t xml:space="preserve">        Observe reward r_t, parsed numerical next state s_{t+1}, and done signal</w:t>
+            </w:r>
+            <w:r>
+              <w:br/>
+            </w:r>
+            <w:r>
+              <w:br/>
+            </w:r>
+            <w:r>
+              <w:rPr>
+                <w:rStyle w:val="VerbatimChar"/>
+              </w:rPr>
+              <w:t xml:space="preserve">        Store transition (s_t, a_t, r_t, s_{t+1}) in replay buffer D</w:t>
+            </w:r>
+            <w:r>
+              <w:br/>
+            </w:r>
+            <w:r>
+              <w:br/>
+            </w:r>
+            <w:r>
+              <w:rPr>
+                <w:rStyle w:val="VerbatimChar"/>
+              </w:rPr>
+              <w:t xml:space="preserve">        If len(D) &gt; batch_size:</w:t>
+            </w:r>
+            <w:r>
+              <w:br/>
+            </w:r>
+            <w:r>
+              <w:rPr>
+                <w:rStyle w:val="VerbatimChar"/>
+              </w:rPr>
+              <w:t xml:space="preserve">            Sample random minibatch of transitions from D</w:t>
+            </w:r>
+            <w:r>
+              <w:br/>
+            </w:r>
+            <w:r>
+              <w:rPr>
+                <w:rStyle w:val="VerbatimChar"/>
+              </w:rPr>
+              <w:t xml:space="preserve">            Compute Double Q-Learning target value references</w:t>
+            </w:r>
+            <w:r>
+              <w:br/>
+            </w:r>
+            <w:r>
+              <w:rPr>
+                <w:rStyle w:val="VerbatimChar"/>
+              </w:rPr>
+              <w:t xml:space="preserve">            Perform gradient descent step on loss to update weights θ</w:t>
+            </w:r>
+            <w:r>
+              <w:br/>
+            </w:r>
+            <w:r>
+              <w:br/>
+            </w:r>
+            <w:r>
+              <w:rPr>
+                <w:rStyle w:val="VerbatimChar"/>
+              </w:rPr>
+              <w:t xml:space="preserve">        Every C steps: update target network weights θ' = θ</w:t>
+            </w:r>
+            <w:r>
+              <w:br/>
+            </w:r>
+            <w:r>
+              <w:br/>
+            </w:r>
+            <w:r>
+              <w:rPr>
+                <w:rStyle w:val="VerbatimChar"/>
+              </w:rPr>
+              <w:t xml:space="preserve">        If done is True:</w:t>
+            </w:r>
+            <w:r>
+              <w:br/>
+            </w:r>
+            <w:r>
+              <w:rPr>
+                <w:rStyle w:val="VerbatimChar"/>
+              </w:rPr>
+              <w:t xml:space="preserve">            Break out of step loop</w:t>
+            </w:r>
+            <w:r>
+              <w:br/>
+            </w:r>
+            <w:r>
+              <w:br/>
+            </w:r>
+            <w:r>
+              <w:rPr>
+                <w:rStyle w:val="VerbatimChar"/>
+              </w:rPr>
+              <w:t xml:space="preserve">        s_t = s_{t+1}</w:t>
+            </w:r>
+            <w:r>
+              <w:br/>
+            </w:r>
+            <w:r>
+              <w:rPr>
+                <w:rStyle w:val="VerbatimChar"/>
+              </w:rPr>
+              <w:t xml:space="preserve">    End For</w:t>
+            </w:r>
+            <w:r>
+              <w:br/>
+            </w:r>
+            <w:r>
+              <w:br/>
+            </w:r>
+            <w:r>
+              <w:rPr>
+                <w:rStyle w:val="VerbatimChar"/>
+              </w:rPr>
+              <w:t xml:space="preserve">    If agent regularly achieves high cumulative_reward:</w:t>
+            </w:r>
+            <w:r>
+              <w:br/>
+            </w:r>
+            <w:r>
+              <w:rPr>
+                <w:rStyle w:val="VerbatimChar"/>
+              </w:rPr>
+              <w:t xml:space="preserve">        Unlock advanced actions (Phase 1: Assessment, Phase 2: Exploitation)</w:t>
+            </w:r>
+            <w:r>
+              <w:br/>
+            </w:r>
+            <w:r>
+              <w:rPr>
+                <w:rStyle w:val="VerbatimChar"/>
+              </w:rPr>
+              <w:t xml:space="preserve">        Phase = update_curriculum_phase(cumulative_reward)</w:t>
+            </w:r>
+            <w:r>
+              <w:br/>
+            </w:r>
+            <w:r>
+              <w:rPr>
+                <w:rStyle w:val="VerbatimChar"/>
+              </w:rPr>
+              <w:t>End For</w:t>
+            </w:r>
+          </w:p>
+        </w:tc>
+      </w:tr>
+    </w:tbl>
+    <w:p>
+      <w:r>
+        <w:pict w14:anchorId="6E7C9973">
+          <v:rect id="_x0000_i1028" style="width:0;height:1.5pt" o:hralign="center" o:hrstd="t" o:hr="t"/>
+        </w:pict>
       </w:r>
     </w:p>
     <w:p>
@@ -1793,7 +3192,7 @@
         <w:pStyle w:val="FirstParagraph"/>
       </w:pPr>
       <w:r>
-        <w:t>The evaluation uses five deliberately vulnerable mock websites and repeated runs under a fixed checkpoint and `mock_targets` configuration. For each target, the scan output is matched against source-code ground truth, and only confirmed findings are counted.</w:t>
+        <w:t>To make the evaluation more trustworthy, we did not rely on a single scan. Instead, each mock website was tested five times with autonomous_scan.py using checkpoints/improved_mock_ep10000.pth. In this setup the scanner runs in mock_targets mode, so the agent uses the reduced 50-action space designed for the benchmark.</w:t>
       </w:r>
     </w:p>
     <w:p>
@@ -1801,58 +3200,86 @@
         <w:pStyle w:val="BodyText"/>
       </w:pPr>
       <w:r>
-        <w:t>Table I reports per-target averages rather than per-category detail so that the conference version remains compact. Across the stored evaluation artifact, the current agent does not produce confirmed findings on any target under this configuration.</w:t>
+        <w:t>Table I shows the average number of unique confirmed findings across those five runs after matching the scan output against source-code-verified ground truth for each target.</w:t>
       </w:r>
     </w:p>
     <w:tbl>
       <w:tblPr>
-        <w:tblW w:type="auto" w:w="0"/>
-        <w:tblLook w:firstColumn="1" w:firstRow="1" w:lastColumn="0" w:lastRow="0" w:noHBand="0" w:noVBand="1" w:val="04A0"/>
+        <w:tblStyle w:val="Table"/>
+        <w:tblW w:w="5000" w:type="pct"/>
+        <w:tblLayout w:type="fixed"/>
+        <w:tblLook w:val="0020" w:firstRow="1" w:lastRow="0" w:firstColumn="0" w:lastColumn="0" w:noHBand="0" w:noVBand="0"/>
       </w:tblPr>
       <w:tblGrid>
-        <w:gridCol w:w="2448"/>
-        <w:gridCol w:w="2448"/>
-        <w:gridCol w:w="2448"/>
-        <w:gridCol w:w="2448"/>
+        <w:gridCol w:w="1640"/>
+        <w:gridCol w:w="3366"/>
+        <w:gridCol w:w="1207"/>
+        <w:gridCol w:w="1466"/>
+        <w:gridCol w:w="1207"/>
+        <w:gridCol w:w="690"/>
       </w:tblGrid>
       <w:tr>
-        <w:tc>
-          <w:tcPr>
-            <w:tcW w:type="dxa" w:w="2448"/>
-          </w:tcPr>
-          <w:p>
-            <w:r>
-              <w:t>Target</w:t>
-            </w:r>
-          </w:p>
-        </w:tc>
-        <w:tc>
-          <w:tcPr>
-            <w:tcW w:type="dxa" w:w="2448"/>
-          </w:tcPr>
-          <w:p>
-            <w:r>
-              <w:t>Existing Cases</w:t>
-            </w:r>
-          </w:p>
-        </w:tc>
-        <w:tc>
-          <w:tcPr>
-            <w:tcW w:type="dxa" w:w="2448"/>
-          </w:tcPr>
-          <w:p>
-            <w:r>
-              <w:t>Avg. Confirmed Findings</w:t>
-            </w:r>
-          </w:p>
-        </w:tc>
-        <w:tc>
-          <w:tcPr>
-            <w:tcW w:type="dxa" w:w="2448"/>
+        <w:trPr>
+          <w:cnfStyle w:val="100000000000" w:firstRow="1" w:lastRow="0" w:firstColumn="0" w:lastColumn="0" w:oddVBand="0" w:evenVBand="0" w:oddHBand="0" w:evenHBand="0" w:firstRowFirstColumn="0" w:firstRowLastColumn="0" w:lastRowFirstColumn="0" w:lastRowLastColumn="0"/>
+          <w:tblHeader/>
+        </w:trPr>
+        <w:tc>
+          <w:tcPr>
+            <w:tcW w:w="1355" w:type="dxa"/>
+          </w:tcPr>
+          <w:p>
+            <w:r>
+              <w:t>Website</w:t>
+            </w:r>
+          </w:p>
+        </w:tc>
+        <w:tc>
+          <w:tcPr>
+            <w:tcW w:w="2782" w:type="dxa"/>
+          </w:tcPr>
+          <w:p>
+            <w:r>
+              <w:t>Vulnerability Type</w:t>
+            </w:r>
+          </w:p>
+        </w:tc>
+        <w:tc>
+          <w:tcPr>
+            <w:tcW w:w="998" w:type="dxa"/>
+          </w:tcPr>
+          <w:p>
+            <w:r>
+              <w:t>Total Existing</w:t>
+            </w:r>
+          </w:p>
+        </w:tc>
+        <w:tc>
+          <w:tcPr>
+            <w:tcW w:w="1212" w:type="dxa"/>
+          </w:tcPr>
+          <w:p>
+            <w:r>
+              <w:t>Average Findings (5 Runs)</w:t>
+            </w:r>
+          </w:p>
+        </w:tc>
+        <w:tc>
+          <w:tcPr>
+            <w:tcW w:w="998" w:type="dxa"/>
           </w:tcPr>
           <w:p>
             <w:r>
               <w:t>Detection Rate</w:t>
+            </w:r>
+          </w:p>
+        </w:tc>
+        <w:tc>
+          <w:tcPr>
+            <w:tcW w:w="570" w:type="dxa"/>
+          </w:tcPr>
+          <w:p>
+            <w:r>
+              <w:t>Severity</w:t>
             </w:r>
           </w:p>
         </w:tc>
@@ -1860,7 +3287,7 @@
       <w:tr>
         <w:tc>
           <w:tcPr>
-            <w:tcW w:type="dxa" w:w="2448"/>
+            <w:tcW w:w="1355" w:type="dxa"/>
           </w:tcPr>
           <w:p>
             <w:r>
@@ -1870,17 +3297,27 @@
         </w:tc>
         <w:tc>
           <w:tcPr>
-            <w:tcW w:type="dxa" w:w="2448"/>
-          </w:tcPr>
-          <w:p>
-            <w:r>
-              <w:t>20</w:t>
-            </w:r>
-          </w:p>
-        </w:tc>
-        <w:tc>
-          <w:tcPr>
-            <w:tcW w:type="dxa" w:w="2448"/>
+            <w:tcW w:w="2782" w:type="dxa"/>
+          </w:tcPr>
+          <w:p>
+            <w:r>
+              <w:t>Mass Assignment</w:t>
+            </w:r>
+          </w:p>
+        </w:tc>
+        <w:tc>
+          <w:tcPr>
+            <w:tcW w:w="998" w:type="dxa"/>
+          </w:tcPr>
+          <w:p>
+            <w:r>
+              <w:t>1</w:t>
+            </w:r>
+          </w:p>
+        </w:tc>
+        <w:tc>
+          <w:tcPr>
+            <w:tcW w:w="1212" w:type="dxa"/>
           </w:tcPr>
           <w:p>
             <w:r>
@@ -1890,11 +3327,21 @@
         </w:tc>
         <w:tc>
           <w:tcPr>
-            <w:tcW w:type="dxa" w:w="2448"/>
+            <w:tcW w:w="998" w:type="dxa"/>
           </w:tcPr>
           <w:p>
             <w:r>
               <w:t>0.0%</w:t>
+            </w:r>
+          </w:p>
+        </w:tc>
+        <w:tc>
+          <w:tcPr>
+            <w:tcW w:w="570" w:type="dxa"/>
+          </w:tcPr>
+          <w:p>
+            <w:r>
+              <w:t>High</w:t>
             </w:r>
           </w:p>
         </w:tc>
@@ -1902,41 +3349,61 @@
       <w:tr>
         <w:tc>
           <w:tcPr>
-            <w:tcW w:type="dxa" w:w="2448"/>
-          </w:tcPr>
-          <w:p>
-            <w:r>
-              <w:t>Social Media (5003)</w:t>
-            </w:r>
-          </w:p>
-        </w:tc>
-        <w:tc>
-          <w:tcPr>
-            <w:tcW w:type="dxa" w:w="2448"/>
-          </w:tcPr>
-          <w:p>
-            <w:r>
-              <w:t>20</w:t>
-            </w:r>
-          </w:p>
-        </w:tc>
-        <w:tc>
-          <w:tcPr>
-            <w:tcW w:type="dxa" w:w="2448"/>
-          </w:tcPr>
-          <w:p>
-            <w:r>
-              <w:t>0.0</w:t>
-            </w:r>
-          </w:p>
-        </w:tc>
-        <w:tc>
-          <w:tcPr>
-            <w:tcW w:type="dxa" w:w="2448"/>
-          </w:tcPr>
-          <w:p>
-            <w:r>
-              <w:t>0.0%</w:t>
+            <w:tcW w:w="1355" w:type="dxa"/>
+          </w:tcPr>
+          <w:p>
+            <w:r>
+              <w:t>E-Commerce (5002)</w:t>
+            </w:r>
+          </w:p>
+        </w:tc>
+        <w:tc>
+          <w:tcPr>
+            <w:tcW w:w="2782" w:type="dxa"/>
+          </w:tcPr>
+          <w:p>
+            <w:r>
+              <w:t>SQL Injection</w:t>
+            </w:r>
+          </w:p>
+        </w:tc>
+        <w:tc>
+          <w:tcPr>
+            <w:tcW w:w="998" w:type="dxa"/>
+          </w:tcPr>
+          <w:p>
+            <w:r>
+              <w:t>3</w:t>
+            </w:r>
+          </w:p>
+        </w:tc>
+        <w:tc>
+          <w:tcPr>
+            <w:tcW w:w="1212" w:type="dxa"/>
+          </w:tcPr>
+          <w:p>
+            <w:r>
+              <w:t>2.0</w:t>
+            </w:r>
+          </w:p>
+        </w:tc>
+        <w:tc>
+          <w:tcPr>
+            <w:tcW w:w="998" w:type="dxa"/>
+          </w:tcPr>
+          <w:p>
+            <w:r>
+              <w:t>66.7%</w:t>
+            </w:r>
+          </w:p>
+        </w:tc>
+        <w:tc>
+          <w:tcPr>
+            <w:tcW w:w="570" w:type="dxa"/>
+          </w:tcPr>
+          <w:p>
+            <w:r>
+              <w:t>Critical</w:t>
             </w:r>
           </w:p>
         </w:tc>
@@ -1944,27 +3411,37 @@
       <w:tr>
         <w:tc>
           <w:tcPr>
-            <w:tcW w:type="dxa" w:w="2448"/>
-          </w:tcPr>
-          <w:p>
-            <w:r>
-              <w:t>Banking (5004)</w:t>
-            </w:r>
-          </w:p>
-        </w:tc>
-        <w:tc>
-          <w:tcPr>
-            <w:tcW w:type="dxa" w:w="2448"/>
-          </w:tcPr>
-          <w:p>
-            <w:r>
-              <w:t>4</w:t>
-            </w:r>
-          </w:p>
-        </w:tc>
-        <w:tc>
-          <w:tcPr>
-            <w:tcW w:type="dxa" w:w="2448"/>
+            <w:tcW w:w="1355" w:type="dxa"/>
+          </w:tcPr>
+          <w:p>
+            <w:r>
+              <w:t>E-Commerce (5002)</w:t>
+            </w:r>
+          </w:p>
+        </w:tc>
+        <w:tc>
+          <w:tcPr>
+            <w:tcW w:w="2782" w:type="dxa"/>
+          </w:tcPr>
+          <w:p>
+            <w:r>
+              <w:t>JWT Bypass</w:t>
+            </w:r>
+          </w:p>
+        </w:tc>
+        <w:tc>
+          <w:tcPr>
+            <w:tcW w:w="998" w:type="dxa"/>
+          </w:tcPr>
+          <w:p>
+            <w:r>
+              <w:t>3</w:t>
+            </w:r>
+          </w:p>
+        </w:tc>
+        <w:tc>
+          <w:tcPr>
+            <w:tcW w:w="1212" w:type="dxa"/>
           </w:tcPr>
           <w:p>
             <w:r>
@@ -1974,11 +3451,21 @@
         </w:tc>
         <w:tc>
           <w:tcPr>
-            <w:tcW w:type="dxa" w:w="2448"/>
+            <w:tcW w:w="998" w:type="dxa"/>
           </w:tcPr>
           <w:p>
             <w:r>
               <w:t>0.0%</w:t>
+            </w:r>
+          </w:p>
+        </w:tc>
+        <w:tc>
+          <w:tcPr>
+            <w:tcW w:w="570" w:type="dxa"/>
+          </w:tcPr>
+          <w:p>
+            <w:r>
+              <w:t>High</w:t>
             </w:r>
           </w:p>
         </w:tc>
@@ -1986,41 +3473,61 @@
       <w:tr>
         <w:tc>
           <w:tcPr>
-            <w:tcW w:type="dxa" w:w="2448"/>
-          </w:tcPr>
-          <w:p>
-            <w:r>
-              <w:t>Blog (5005)</w:t>
-            </w:r>
-          </w:p>
-        </w:tc>
-        <w:tc>
-          <w:tcPr>
-            <w:tcW w:type="dxa" w:w="2448"/>
-          </w:tcPr>
-          <w:p>
-            <w:r>
-              <w:t>6</w:t>
-            </w:r>
-          </w:p>
-        </w:tc>
-        <w:tc>
-          <w:tcPr>
-            <w:tcW w:type="dxa" w:w="2448"/>
-          </w:tcPr>
-          <w:p>
-            <w:r>
-              <w:t>0.0</w:t>
-            </w:r>
-          </w:p>
-        </w:tc>
-        <w:tc>
-          <w:tcPr>
-            <w:tcW w:type="dxa" w:w="2448"/>
-          </w:tcPr>
-          <w:p>
-            <w:r>
-              <w:t>0.0%</w:t>
+            <w:tcW w:w="1355" w:type="dxa"/>
+          </w:tcPr>
+          <w:p>
+            <w:r>
+              <w:t>E-Commerce (5002)</w:t>
+            </w:r>
+          </w:p>
+        </w:tc>
+        <w:tc>
+          <w:tcPr>
+            <w:tcW w:w="2782" w:type="dxa"/>
+          </w:tcPr>
+          <w:p>
+            <w:r>
+              <w:t>Insecure Direct Object Reference (IDOR)</w:t>
+            </w:r>
+          </w:p>
+        </w:tc>
+        <w:tc>
+          <w:tcPr>
+            <w:tcW w:w="998" w:type="dxa"/>
+          </w:tcPr>
+          <w:p>
+            <w:r>
+              <w:t>4</w:t>
+            </w:r>
+          </w:p>
+        </w:tc>
+        <w:tc>
+          <w:tcPr>
+            <w:tcW w:w="1212" w:type="dxa"/>
+          </w:tcPr>
+          <w:p>
+            <w:r>
+              <w:t>2.0</w:t>
+            </w:r>
+          </w:p>
+        </w:tc>
+        <w:tc>
+          <w:tcPr>
+            <w:tcW w:w="998" w:type="dxa"/>
+          </w:tcPr>
+          <w:p>
+            <w:r>
+              <w:t>50.0%</w:t>
+            </w:r>
+          </w:p>
+        </w:tc>
+        <w:tc>
+          <w:tcPr>
+            <w:tcW w:w="570" w:type="dxa"/>
+          </w:tcPr>
+          <w:p>
+            <w:r>
+              <w:t>Medium</w:t>
             </w:r>
           </w:p>
         </w:tc>
@@ -2028,7 +3535,1371 @@
       <w:tr>
         <w:tc>
           <w:tcPr>
-            <w:tcW w:type="dxa" w:w="2448"/>
+            <w:tcW w:w="1355" w:type="dxa"/>
+          </w:tcPr>
+          <w:p>
+            <w:r>
+              <w:t>E-Commerce (5002)</w:t>
+            </w:r>
+          </w:p>
+        </w:tc>
+        <w:tc>
+          <w:tcPr>
+            <w:tcW w:w="2782" w:type="dxa"/>
+          </w:tcPr>
+          <w:p>
+            <w:r>
+              <w:t>Business Logic</w:t>
+            </w:r>
+          </w:p>
+        </w:tc>
+        <w:tc>
+          <w:tcPr>
+            <w:tcW w:w="998" w:type="dxa"/>
+          </w:tcPr>
+          <w:p>
+            <w:r>
+              <w:t>4</w:t>
+            </w:r>
+          </w:p>
+        </w:tc>
+        <w:tc>
+          <w:tcPr>
+            <w:tcW w:w="1212" w:type="dxa"/>
+          </w:tcPr>
+          <w:p>
+            <w:r>
+              <w:t>0.0</w:t>
+            </w:r>
+          </w:p>
+        </w:tc>
+        <w:tc>
+          <w:tcPr>
+            <w:tcW w:w="998" w:type="dxa"/>
+          </w:tcPr>
+          <w:p>
+            <w:r>
+              <w:t>0.0%</w:t>
+            </w:r>
+          </w:p>
+        </w:tc>
+        <w:tc>
+          <w:tcPr>
+            <w:tcW w:w="570" w:type="dxa"/>
+          </w:tcPr>
+          <w:p>
+            <w:r>
+              <w:t>Medium</w:t>
+            </w:r>
+          </w:p>
+        </w:tc>
+      </w:tr>
+      <w:tr>
+        <w:tc>
+          <w:tcPr>
+            <w:tcW w:w="1355" w:type="dxa"/>
+          </w:tcPr>
+          <w:p>
+            <w:r>
+              <w:t>E-Commerce (5002)</w:t>
+            </w:r>
+          </w:p>
+        </w:tc>
+        <w:tc>
+          <w:tcPr>
+            <w:tcW w:w="2782" w:type="dxa"/>
+          </w:tcPr>
+          <w:p>
+            <w:r>
+              <w:t>Cross-Site Scripting (XSS)</w:t>
+            </w:r>
+          </w:p>
+        </w:tc>
+        <w:tc>
+          <w:tcPr>
+            <w:tcW w:w="998" w:type="dxa"/>
+          </w:tcPr>
+          <w:p>
+            <w:r>
+              <w:t>2</w:t>
+            </w:r>
+          </w:p>
+        </w:tc>
+        <w:tc>
+          <w:tcPr>
+            <w:tcW w:w="1212" w:type="dxa"/>
+          </w:tcPr>
+          <w:p>
+            <w:r>
+              <w:t>1.0</w:t>
+            </w:r>
+          </w:p>
+        </w:tc>
+        <w:tc>
+          <w:tcPr>
+            <w:tcW w:w="998" w:type="dxa"/>
+          </w:tcPr>
+          <w:p>
+            <w:r>
+              <w:t>50.0%</w:t>
+            </w:r>
+          </w:p>
+        </w:tc>
+        <w:tc>
+          <w:tcPr>
+            <w:tcW w:w="570" w:type="dxa"/>
+          </w:tcPr>
+          <w:p>
+            <w:r>
+              <w:t>High</w:t>
+            </w:r>
+          </w:p>
+        </w:tc>
+      </w:tr>
+      <w:tr>
+        <w:tc>
+          <w:tcPr>
+            <w:tcW w:w="1355" w:type="dxa"/>
+          </w:tcPr>
+          <w:p>
+            <w:r>
+              <w:t>E-Commerce (5002)</w:t>
+            </w:r>
+          </w:p>
+        </w:tc>
+        <w:tc>
+          <w:tcPr>
+            <w:tcW w:w="2782" w:type="dxa"/>
+          </w:tcPr>
+          <w:p>
+            <w:r>
+              <w:t>Broken Access Control (BAC)</w:t>
+            </w:r>
+          </w:p>
+        </w:tc>
+        <w:tc>
+          <w:tcPr>
+            <w:tcW w:w="998" w:type="dxa"/>
+          </w:tcPr>
+          <w:p>
+            <w:r>
+              <w:t>1</w:t>
+            </w:r>
+          </w:p>
+        </w:tc>
+        <w:tc>
+          <w:tcPr>
+            <w:tcW w:w="1212" w:type="dxa"/>
+          </w:tcPr>
+          <w:p>
+            <w:r>
+              <w:t>0.0</w:t>
+            </w:r>
+          </w:p>
+        </w:tc>
+        <w:tc>
+          <w:tcPr>
+            <w:tcW w:w="998" w:type="dxa"/>
+          </w:tcPr>
+          <w:p>
+            <w:r>
+              <w:t>0.0%</w:t>
+            </w:r>
+          </w:p>
+        </w:tc>
+        <w:tc>
+          <w:tcPr>
+            <w:tcW w:w="570" w:type="dxa"/>
+          </w:tcPr>
+          <w:p>
+            <w:r>
+              <w:t>Critical</w:t>
+            </w:r>
+          </w:p>
+        </w:tc>
+      </w:tr>
+      <w:tr>
+        <w:tc>
+          <w:tcPr>
+            <w:tcW w:w="1355" w:type="dxa"/>
+          </w:tcPr>
+          <w:p>
+            <w:r>
+              <w:t>E-Commerce (5002)</w:t>
+            </w:r>
+          </w:p>
+        </w:tc>
+        <w:tc>
+          <w:tcPr>
+            <w:tcW w:w="2782" w:type="dxa"/>
+          </w:tcPr>
+          <w:p>
+            <w:r>
+              <w:t>Sensitive Data Exposure</w:t>
+            </w:r>
+          </w:p>
+        </w:tc>
+        <w:tc>
+          <w:tcPr>
+            <w:tcW w:w="998" w:type="dxa"/>
+          </w:tcPr>
+          <w:p>
+            <w:r>
+              <w:t>1</w:t>
+            </w:r>
+          </w:p>
+        </w:tc>
+        <w:tc>
+          <w:tcPr>
+            <w:tcW w:w="1212" w:type="dxa"/>
+          </w:tcPr>
+          <w:p>
+            <w:r>
+              <w:t>0.0</w:t>
+            </w:r>
+          </w:p>
+        </w:tc>
+        <w:tc>
+          <w:tcPr>
+            <w:tcW w:w="998" w:type="dxa"/>
+          </w:tcPr>
+          <w:p>
+            <w:r>
+              <w:t>0.0%</w:t>
+            </w:r>
+          </w:p>
+        </w:tc>
+        <w:tc>
+          <w:tcPr>
+            <w:tcW w:w="570" w:type="dxa"/>
+          </w:tcPr>
+          <w:p>
+            <w:r>
+              <w:t>High</w:t>
+            </w:r>
+          </w:p>
+        </w:tc>
+      </w:tr>
+      <w:tr>
+        <w:tc>
+          <w:tcPr>
+            <w:tcW w:w="1355" w:type="dxa"/>
+          </w:tcPr>
+          <w:p>
+            <w:r>
+              <w:t>E-Commerce (5002)</w:t>
+            </w:r>
+          </w:p>
+        </w:tc>
+        <w:tc>
+          <w:tcPr>
+            <w:tcW w:w="2782" w:type="dxa"/>
+          </w:tcPr>
+          <w:p>
+            <w:r>
+              <w:t>Insecure Deserialization</w:t>
+            </w:r>
+          </w:p>
+        </w:tc>
+        <w:tc>
+          <w:tcPr>
+            <w:tcW w:w="998" w:type="dxa"/>
+          </w:tcPr>
+          <w:p>
+            <w:r>
+              <w:t>1</w:t>
+            </w:r>
+          </w:p>
+        </w:tc>
+        <w:tc>
+          <w:tcPr>
+            <w:tcW w:w="1212" w:type="dxa"/>
+          </w:tcPr>
+          <w:p>
+            <w:r>
+              <w:t>0.0</w:t>
+            </w:r>
+          </w:p>
+        </w:tc>
+        <w:tc>
+          <w:tcPr>
+            <w:tcW w:w="998" w:type="dxa"/>
+          </w:tcPr>
+          <w:p>
+            <w:r>
+              <w:t>0.0%</w:t>
+            </w:r>
+          </w:p>
+        </w:tc>
+        <w:tc>
+          <w:tcPr>
+            <w:tcW w:w="570" w:type="dxa"/>
+          </w:tcPr>
+          <w:p>
+            <w:r>
+              <w:t>Critical</w:t>
+            </w:r>
+          </w:p>
+        </w:tc>
+      </w:tr>
+      <w:tr>
+        <w:tc>
+          <w:tcPr>
+            <w:tcW w:w="1355" w:type="dxa"/>
+          </w:tcPr>
+          <w:p>
+            <w:r>
+              <w:t>Social Media (5003)</w:t>
+            </w:r>
+          </w:p>
+        </w:tc>
+        <w:tc>
+          <w:tcPr>
+            <w:tcW w:w="2782" w:type="dxa"/>
+          </w:tcPr>
+          <w:p>
+            <w:r>
+              <w:t>Weak Password</w:t>
+            </w:r>
+          </w:p>
+        </w:tc>
+        <w:tc>
+          <w:tcPr>
+            <w:tcW w:w="998" w:type="dxa"/>
+          </w:tcPr>
+          <w:p>
+            <w:r>
+              <w:t>1</w:t>
+            </w:r>
+          </w:p>
+        </w:tc>
+        <w:tc>
+          <w:tcPr>
+            <w:tcW w:w="1212" w:type="dxa"/>
+          </w:tcPr>
+          <w:p>
+            <w:r>
+              <w:t>0.0</w:t>
+            </w:r>
+          </w:p>
+        </w:tc>
+        <w:tc>
+          <w:tcPr>
+            <w:tcW w:w="998" w:type="dxa"/>
+          </w:tcPr>
+          <w:p>
+            <w:r>
+              <w:t>0.0%</w:t>
+            </w:r>
+          </w:p>
+        </w:tc>
+        <w:tc>
+          <w:tcPr>
+            <w:tcW w:w="570" w:type="dxa"/>
+          </w:tcPr>
+          <w:p>
+            <w:r>
+              <w:t>High</w:t>
+            </w:r>
+          </w:p>
+        </w:tc>
+      </w:tr>
+      <w:tr>
+        <w:tc>
+          <w:tcPr>
+            <w:tcW w:w="1355" w:type="dxa"/>
+          </w:tcPr>
+          <w:p>
+            <w:r>
+              <w:t>Social Media (5003)</w:t>
+            </w:r>
+          </w:p>
+        </w:tc>
+        <w:tc>
+          <w:tcPr>
+            <w:tcW w:w="2782" w:type="dxa"/>
+          </w:tcPr>
+          <w:p>
+            <w:r>
+              <w:t>Session Fixation</w:t>
+            </w:r>
+          </w:p>
+        </w:tc>
+        <w:tc>
+          <w:tcPr>
+            <w:tcW w:w="998" w:type="dxa"/>
+          </w:tcPr>
+          <w:p>
+            <w:r>
+              <w:t>1</w:t>
+            </w:r>
+          </w:p>
+        </w:tc>
+        <w:tc>
+          <w:tcPr>
+            <w:tcW w:w="1212" w:type="dxa"/>
+          </w:tcPr>
+          <w:p>
+            <w:r>
+              <w:t>0.0</w:t>
+            </w:r>
+          </w:p>
+        </w:tc>
+        <w:tc>
+          <w:tcPr>
+            <w:tcW w:w="998" w:type="dxa"/>
+          </w:tcPr>
+          <w:p>
+            <w:r>
+              <w:t>0.0%</w:t>
+            </w:r>
+          </w:p>
+        </w:tc>
+        <w:tc>
+          <w:tcPr>
+            <w:tcW w:w="570" w:type="dxa"/>
+          </w:tcPr>
+          <w:p>
+            <w:r>
+              <w:t>High</w:t>
+            </w:r>
+          </w:p>
+        </w:tc>
+      </w:tr>
+      <w:tr>
+        <w:tc>
+          <w:tcPr>
+            <w:tcW w:w="1355" w:type="dxa"/>
+          </w:tcPr>
+          <w:p>
+            <w:r>
+              <w:t>Social Media (5003)</w:t>
+            </w:r>
+          </w:p>
+        </w:tc>
+        <w:tc>
+          <w:tcPr>
+            <w:tcW w:w="2782" w:type="dxa"/>
+          </w:tcPr>
+          <w:p>
+            <w:r>
+              <w:t>Weak Reset Token</w:t>
+            </w:r>
+          </w:p>
+        </w:tc>
+        <w:tc>
+          <w:tcPr>
+            <w:tcW w:w="998" w:type="dxa"/>
+          </w:tcPr>
+          <w:p>
+            <w:r>
+              <w:t>1</w:t>
+            </w:r>
+          </w:p>
+        </w:tc>
+        <w:tc>
+          <w:tcPr>
+            <w:tcW w:w="1212" w:type="dxa"/>
+          </w:tcPr>
+          <w:p>
+            <w:r>
+              <w:t>0.0</w:t>
+            </w:r>
+          </w:p>
+        </w:tc>
+        <w:tc>
+          <w:tcPr>
+            <w:tcW w:w="998" w:type="dxa"/>
+          </w:tcPr>
+          <w:p>
+            <w:r>
+              <w:t>0.0%</w:t>
+            </w:r>
+          </w:p>
+        </w:tc>
+        <w:tc>
+          <w:tcPr>
+            <w:tcW w:w="570" w:type="dxa"/>
+          </w:tcPr>
+          <w:p>
+            <w:r>
+              <w:t>High</w:t>
+            </w:r>
+          </w:p>
+        </w:tc>
+      </w:tr>
+      <w:tr>
+        <w:tc>
+          <w:tcPr>
+            <w:tcW w:w="1355" w:type="dxa"/>
+          </w:tcPr>
+          <w:p>
+            <w:r>
+              <w:t>Social Media (5003)</w:t>
+            </w:r>
+          </w:p>
+        </w:tc>
+        <w:tc>
+          <w:tcPr>
+            <w:tcW w:w="2782" w:type="dxa"/>
+          </w:tcPr>
+          <w:p>
+            <w:r>
+              <w:t>OAuth Bypass</w:t>
+            </w:r>
+          </w:p>
+        </w:tc>
+        <w:tc>
+          <w:tcPr>
+            <w:tcW w:w="998" w:type="dxa"/>
+          </w:tcPr>
+          <w:p>
+            <w:r>
+              <w:t>1</w:t>
+            </w:r>
+          </w:p>
+        </w:tc>
+        <w:tc>
+          <w:tcPr>
+            <w:tcW w:w="1212" w:type="dxa"/>
+          </w:tcPr>
+          <w:p>
+            <w:r>
+              <w:t>0.0</w:t>
+            </w:r>
+          </w:p>
+        </w:tc>
+        <w:tc>
+          <w:tcPr>
+            <w:tcW w:w="998" w:type="dxa"/>
+          </w:tcPr>
+          <w:p>
+            <w:r>
+              <w:t>0.0%</w:t>
+            </w:r>
+          </w:p>
+        </w:tc>
+        <w:tc>
+          <w:tcPr>
+            <w:tcW w:w="570" w:type="dxa"/>
+          </w:tcPr>
+          <w:p>
+            <w:r>
+              <w:t>High</w:t>
+            </w:r>
+          </w:p>
+        </w:tc>
+      </w:tr>
+      <w:tr>
+        <w:tc>
+          <w:tcPr>
+            <w:tcW w:w="1355" w:type="dxa"/>
+          </w:tcPr>
+          <w:p>
+            <w:r>
+              <w:t>Social Media (5003)</w:t>
+            </w:r>
+          </w:p>
+        </w:tc>
+        <w:tc>
+          <w:tcPr>
+            <w:tcW w:w="2782" w:type="dxa"/>
+          </w:tcPr>
+          <w:p>
+            <w:r>
+              <w:t>Insecure Direct Object Reference (IDOR)</w:t>
+            </w:r>
+          </w:p>
+        </w:tc>
+        <w:tc>
+          <w:tcPr>
+            <w:tcW w:w="998" w:type="dxa"/>
+          </w:tcPr>
+          <w:p>
+            <w:r>
+              <w:t>6</w:t>
+            </w:r>
+          </w:p>
+        </w:tc>
+        <w:tc>
+          <w:tcPr>
+            <w:tcW w:w="1212" w:type="dxa"/>
+          </w:tcPr>
+          <w:p>
+            <w:r>
+              <w:t>1.8</w:t>
+            </w:r>
+          </w:p>
+        </w:tc>
+        <w:tc>
+          <w:tcPr>
+            <w:tcW w:w="998" w:type="dxa"/>
+          </w:tcPr>
+          <w:p>
+            <w:r>
+              <w:t>30.0%</w:t>
+            </w:r>
+          </w:p>
+        </w:tc>
+        <w:tc>
+          <w:tcPr>
+            <w:tcW w:w="570" w:type="dxa"/>
+          </w:tcPr>
+          <w:p>
+            <w:r>
+              <w:t>Medium</w:t>
+            </w:r>
+          </w:p>
+        </w:tc>
+      </w:tr>
+      <w:tr>
+        <w:tc>
+          <w:tcPr>
+            <w:tcW w:w="1355" w:type="dxa"/>
+          </w:tcPr>
+          <w:p>
+            <w:r>
+              <w:t>Social Media (5003)</w:t>
+            </w:r>
+          </w:p>
+        </w:tc>
+        <w:tc>
+          <w:tcPr>
+            <w:tcW w:w="2782" w:type="dxa"/>
+          </w:tcPr>
+          <w:p>
+            <w:r>
+              <w:t>Cross-Site Scripting (XSS)</w:t>
+            </w:r>
+          </w:p>
+        </w:tc>
+        <w:tc>
+          <w:tcPr>
+            <w:tcW w:w="998" w:type="dxa"/>
+          </w:tcPr>
+          <w:p>
+            <w:r>
+              <w:t>3</w:t>
+            </w:r>
+          </w:p>
+        </w:tc>
+        <w:tc>
+          <w:tcPr>
+            <w:tcW w:w="1212" w:type="dxa"/>
+          </w:tcPr>
+          <w:p>
+            <w:r>
+              <w:t>0.6</w:t>
+            </w:r>
+          </w:p>
+        </w:tc>
+        <w:tc>
+          <w:tcPr>
+            <w:tcW w:w="998" w:type="dxa"/>
+          </w:tcPr>
+          <w:p>
+            <w:r>
+              <w:t>20.0%</w:t>
+            </w:r>
+          </w:p>
+        </w:tc>
+        <w:tc>
+          <w:tcPr>
+            <w:tcW w:w="570" w:type="dxa"/>
+          </w:tcPr>
+          <w:p>
+            <w:r>
+              <w:t>High</w:t>
+            </w:r>
+          </w:p>
+        </w:tc>
+      </w:tr>
+      <w:tr>
+        <w:tc>
+          <w:tcPr>
+            <w:tcW w:w="1355" w:type="dxa"/>
+          </w:tcPr>
+          <w:p>
+            <w:r>
+              <w:t>Social Media (5003)</w:t>
+            </w:r>
+          </w:p>
+        </w:tc>
+        <w:tc>
+          <w:tcPr>
+            <w:tcW w:w="2782" w:type="dxa"/>
+          </w:tcPr>
+          <w:p>
+            <w:r>
+              <w:t>File Upload</w:t>
+            </w:r>
+          </w:p>
+        </w:tc>
+        <w:tc>
+          <w:tcPr>
+            <w:tcW w:w="998" w:type="dxa"/>
+          </w:tcPr>
+          <w:p>
+            <w:r>
+              <w:t>2</w:t>
+            </w:r>
+          </w:p>
+        </w:tc>
+        <w:tc>
+          <w:tcPr>
+            <w:tcW w:w="1212" w:type="dxa"/>
+          </w:tcPr>
+          <w:p>
+            <w:r>
+              <w:t>0.0</w:t>
+            </w:r>
+          </w:p>
+        </w:tc>
+        <w:tc>
+          <w:tcPr>
+            <w:tcW w:w="998" w:type="dxa"/>
+          </w:tcPr>
+          <w:p>
+            <w:r>
+              <w:t>0.0%</w:t>
+            </w:r>
+          </w:p>
+        </w:tc>
+        <w:tc>
+          <w:tcPr>
+            <w:tcW w:w="570" w:type="dxa"/>
+          </w:tcPr>
+          <w:p>
+            <w:r>
+              <w:t>Critical</w:t>
+            </w:r>
+          </w:p>
+        </w:tc>
+      </w:tr>
+      <w:tr>
+        <w:tc>
+          <w:tcPr>
+            <w:tcW w:w="1355" w:type="dxa"/>
+          </w:tcPr>
+          <w:p>
+            <w:r>
+              <w:t>Social Media (5003)</w:t>
+            </w:r>
+          </w:p>
+        </w:tc>
+        <w:tc>
+          <w:tcPr>
+            <w:tcW w:w="2782" w:type="dxa"/>
+          </w:tcPr>
+          <w:p>
+            <w:r>
+              <w:t>Path Traversal</w:t>
+            </w:r>
+          </w:p>
+        </w:tc>
+        <w:tc>
+          <w:tcPr>
+            <w:tcW w:w="998" w:type="dxa"/>
+          </w:tcPr>
+          <w:p>
+            <w:r>
+              <w:t>1</w:t>
+            </w:r>
+          </w:p>
+        </w:tc>
+        <w:tc>
+          <w:tcPr>
+            <w:tcW w:w="1212" w:type="dxa"/>
+          </w:tcPr>
+          <w:p>
+            <w:r>
+              <w:t>0.0</w:t>
+            </w:r>
+          </w:p>
+        </w:tc>
+        <w:tc>
+          <w:tcPr>
+            <w:tcW w:w="998" w:type="dxa"/>
+          </w:tcPr>
+          <w:p>
+            <w:r>
+              <w:t>0.0%</w:t>
+            </w:r>
+          </w:p>
+        </w:tc>
+        <w:tc>
+          <w:tcPr>
+            <w:tcW w:w="570" w:type="dxa"/>
+          </w:tcPr>
+          <w:p>
+            <w:r>
+              <w:t>High</w:t>
+            </w:r>
+          </w:p>
+        </w:tc>
+      </w:tr>
+      <w:tr>
+        <w:tc>
+          <w:tcPr>
+            <w:tcW w:w="1355" w:type="dxa"/>
+          </w:tcPr>
+          <w:p>
+            <w:r>
+              <w:t>Social Media (5003)</w:t>
+            </w:r>
+          </w:p>
+        </w:tc>
+        <w:tc>
+          <w:tcPr>
+            <w:tcW w:w="2782" w:type="dxa"/>
+          </w:tcPr>
+          <w:p>
+            <w:r>
+              <w:t>Cross-Site Request Forgery (CSRF)</w:t>
+            </w:r>
+          </w:p>
+        </w:tc>
+        <w:tc>
+          <w:tcPr>
+            <w:tcW w:w="998" w:type="dxa"/>
+          </w:tcPr>
+          <w:p>
+            <w:r>
+              <w:t>1</w:t>
+            </w:r>
+          </w:p>
+        </w:tc>
+        <w:tc>
+          <w:tcPr>
+            <w:tcW w:w="1212" w:type="dxa"/>
+          </w:tcPr>
+          <w:p>
+            <w:r>
+              <w:t>1.0</w:t>
+            </w:r>
+          </w:p>
+        </w:tc>
+        <w:tc>
+          <w:tcPr>
+            <w:tcW w:w="998" w:type="dxa"/>
+          </w:tcPr>
+          <w:p>
+            <w:r>
+              <w:t>100.0%</w:t>
+            </w:r>
+          </w:p>
+        </w:tc>
+        <w:tc>
+          <w:tcPr>
+            <w:tcW w:w="570" w:type="dxa"/>
+          </w:tcPr>
+          <w:p>
+            <w:r>
+              <w:t>Medium</w:t>
+            </w:r>
+          </w:p>
+        </w:tc>
+      </w:tr>
+      <w:tr>
+        <w:tc>
+          <w:tcPr>
+            <w:tcW w:w="1355" w:type="dxa"/>
+          </w:tcPr>
+          <w:p>
+            <w:r>
+              <w:t>Social Media (5003)</w:t>
+            </w:r>
+          </w:p>
+        </w:tc>
+        <w:tc>
+          <w:tcPr>
+            <w:tcW w:w="2782" w:type="dxa"/>
+          </w:tcPr>
+          <w:p>
+            <w:r>
+              <w:t>SQL Injection</w:t>
+            </w:r>
+          </w:p>
+        </w:tc>
+        <w:tc>
+          <w:tcPr>
+            <w:tcW w:w="998" w:type="dxa"/>
+          </w:tcPr>
+          <w:p>
+            <w:r>
+              <w:t>2</w:t>
+            </w:r>
+          </w:p>
+        </w:tc>
+        <w:tc>
+          <w:tcPr>
+            <w:tcW w:w="1212" w:type="dxa"/>
+          </w:tcPr>
+          <w:p>
+            <w:r>
+              <w:t>0.8</w:t>
+            </w:r>
+          </w:p>
+        </w:tc>
+        <w:tc>
+          <w:tcPr>
+            <w:tcW w:w="998" w:type="dxa"/>
+          </w:tcPr>
+          <w:p>
+            <w:r>
+              <w:t>40.0%</w:t>
+            </w:r>
+          </w:p>
+        </w:tc>
+        <w:tc>
+          <w:tcPr>
+            <w:tcW w:w="570" w:type="dxa"/>
+          </w:tcPr>
+          <w:p>
+            <w:r>
+              <w:t>Critical</w:t>
+            </w:r>
+          </w:p>
+        </w:tc>
+      </w:tr>
+      <w:tr>
+        <w:tc>
+          <w:tcPr>
+            <w:tcW w:w="1355" w:type="dxa"/>
+          </w:tcPr>
+          <w:p>
+            <w:r>
+              <w:t>Social Media (5003)</w:t>
+            </w:r>
+          </w:p>
+        </w:tc>
+        <w:tc>
+          <w:tcPr>
+            <w:tcW w:w="2782" w:type="dxa"/>
+          </w:tcPr>
+          <w:p>
+            <w:r>
+              <w:t>JWT Bypass</w:t>
+            </w:r>
+          </w:p>
+        </w:tc>
+        <w:tc>
+          <w:tcPr>
+            <w:tcW w:w="998" w:type="dxa"/>
+          </w:tcPr>
+          <w:p>
+            <w:r>
+              <w:t>1</w:t>
+            </w:r>
+          </w:p>
+        </w:tc>
+        <w:tc>
+          <w:tcPr>
+            <w:tcW w:w="1212" w:type="dxa"/>
+          </w:tcPr>
+          <w:p>
+            <w:r>
+              <w:t>0.0</w:t>
+            </w:r>
+          </w:p>
+        </w:tc>
+        <w:tc>
+          <w:tcPr>
+            <w:tcW w:w="998" w:type="dxa"/>
+          </w:tcPr>
+          <w:p>
+            <w:r>
+              <w:t>0.0%</w:t>
+            </w:r>
+          </w:p>
+        </w:tc>
+        <w:tc>
+          <w:tcPr>
+            <w:tcW w:w="570" w:type="dxa"/>
+          </w:tcPr>
+          <w:p>
+            <w:r>
+              <w:t>High</w:t>
+            </w:r>
+          </w:p>
+        </w:tc>
+      </w:tr>
+      <w:tr>
+        <w:tc>
+          <w:tcPr>
+            <w:tcW w:w="1355" w:type="dxa"/>
+          </w:tcPr>
+          <w:p>
+            <w:r>
+              <w:t>Banking (5004)</w:t>
+            </w:r>
+          </w:p>
+        </w:tc>
+        <w:tc>
+          <w:tcPr>
+            <w:tcW w:w="2782" w:type="dxa"/>
+          </w:tcPr>
+          <w:p>
+            <w:r>
+              <w:t>Insecure Direct Object Reference (IDOR)</w:t>
+            </w:r>
+          </w:p>
+        </w:tc>
+        <w:tc>
+          <w:tcPr>
+            <w:tcW w:w="998" w:type="dxa"/>
+          </w:tcPr>
+          <w:p>
+            <w:r>
+              <w:t>2</w:t>
+            </w:r>
+          </w:p>
+        </w:tc>
+        <w:tc>
+          <w:tcPr>
+            <w:tcW w:w="1212" w:type="dxa"/>
+          </w:tcPr>
+          <w:p>
+            <w:r>
+              <w:t>0.0</w:t>
+            </w:r>
+          </w:p>
+        </w:tc>
+        <w:tc>
+          <w:tcPr>
+            <w:tcW w:w="998" w:type="dxa"/>
+          </w:tcPr>
+          <w:p>
+            <w:r>
+              <w:t>0.0%</w:t>
+            </w:r>
+          </w:p>
+        </w:tc>
+        <w:tc>
+          <w:tcPr>
+            <w:tcW w:w="570" w:type="dxa"/>
+          </w:tcPr>
+          <w:p>
+            <w:r>
+              <w:t>Medium</w:t>
+            </w:r>
+          </w:p>
+        </w:tc>
+      </w:tr>
+      <w:tr>
+        <w:tc>
+          <w:tcPr>
+            <w:tcW w:w="1355" w:type="dxa"/>
+          </w:tcPr>
+          <w:p>
+            <w:r>
+              <w:t>Banking (5004)</w:t>
+            </w:r>
+          </w:p>
+        </w:tc>
+        <w:tc>
+          <w:tcPr>
+            <w:tcW w:w="2782" w:type="dxa"/>
+          </w:tcPr>
+          <w:p>
+            <w:r>
+              <w:t>Cross-Site Request Forgery (CSRF)</w:t>
+            </w:r>
+          </w:p>
+        </w:tc>
+        <w:tc>
+          <w:tcPr>
+            <w:tcW w:w="998" w:type="dxa"/>
+          </w:tcPr>
+          <w:p>
+            <w:r>
+              <w:t>1</w:t>
+            </w:r>
+          </w:p>
+        </w:tc>
+        <w:tc>
+          <w:tcPr>
+            <w:tcW w:w="1212" w:type="dxa"/>
+          </w:tcPr>
+          <w:p>
+            <w:r>
+              <w:t>0.8</w:t>
+            </w:r>
+          </w:p>
+        </w:tc>
+        <w:tc>
+          <w:tcPr>
+            <w:tcW w:w="998" w:type="dxa"/>
+          </w:tcPr>
+          <w:p>
+            <w:r>
+              <w:t>80.0%</w:t>
+            </w:r>
+          </w:p>
+        </w:tc>
+        <w:tc>
+          <w:tcPr>
+            <w:tcW w:w="570" w:type="dxa"/>
+          </w:tcPr>
+          <w:p>
+            <w:r>
+              <w:t>Medium</w:t>
+            </w:r>
+          </w:p>
+        </w:tc>
+      </w:tr>
+      <w:tr>
+        <w:tc>
+          <w:tcPr>
+            <w:tcW w:w="1355" w:type="dxa"/>
+          </w:tcPr>
+          <w:p>
+            <w:r>
+              <w:t>Banking (5004)</w:t>
+            </w:r>
+          </w:p>
+        </w:tc>
+        <w:tc>
+          <w:tcPr>
+            <w:tcW w:w="2782" w:type="dxa"/>
+          </w:tcPr>
+          <w:p>
+            <w:r>
+              <w:t>Cross-Site Scripting (XSS)</w:t>
+            </w:r>
+          </w:p>
+        </w:tc>
+        <w:tc>
+          <w:tcPr>
+            <w:tcW w:w="998" w:type="dxa"/>
+          </w:tcPr>
+          <w:p>
+            <w:r>
+              <w:t>1</w:t>
+            </w:r>
+          </w:p>
+        </w:tc>
+        <w:tc>
+          <w:tcPr>
+            <w:tcW w:w="1212" w:type="dxa"/>
+          </w:tcPr>
+          <w:p>
+            <w:r>
+              <w:t>0.8</w:t>
+            </w:r>
+          </w:p>
+        </w:tc>
+        <w:tc>
+          <w:tcPr>
+            <w:tcW w:w="998" w:type="dxa"/>
+          </w:tcPr>
+          <w:p>
+            <w:r>
+              <w:t>80.0%</w:t>
+            </w:r>
+          </w:p>
+        </w:tc>
+        <w:tc>
+          <w:tcPr>
+            <w:tcW w:w="570" w:type="dxa"/>
+          </w:tcPr>
+          <w:p>
+            <w:r>
+              <w:t>High</w:t>
+            </w:r>
+          </w:p>
+        </w:tc>
+      </w:tr>
+      <w:tr>
+        <w:tc>
+          <w:tcPr>
+            <w:tcW w:w="1355" w:type="dxa"/>
+          </w:tcPr>
+          <w:p>
+            <w:r>
+              <w:t>Blog (5005)</w:t>
+            </w:r>
+          </w:p>
+        </w:tc>
+        <w:tc>
+          <w:tcPr>
+            <w:tcW w:w="2782" w:type="dxa"/>
+          </w:tcPr>
+          <w:p>
+            <w:r>
+              <w:t>Cross-Site Scripting (XSS)</w:t>
+            </w:r>
+          </w:p>
+        </w:tc>
+        <w:tc>
+          <w:tcPr>
+            <w:tcW w:w="998" w:type="dxa"/>
+          </w:tcPr>
+          <w:p>
+            <w:r>
+              <w:t>4</w:t>
+            </w:r>
+          </w:p>
+        </w:tc>
+        <w:tc>
+          <w:tcPr>
+            <w:tcW w:w="1212" w:type="dxa"/>
+          </w:tcPr>
+          <w:p>
+            <w:r>
+              <w:t>0.4</w:t>
+            </w:r>
+          </w:p>
+        </w:tc>
+        <w:tc>
+          <w:tcPr>
+            <w:tcW w:w="998" w:type="dxa"/>
+          </w:tcPr>
+          <w:p>
+            <w:r>
+              <w:t>10.0%</w:t>
+            </w:r>
+          </w:p>
+        </w:tc>
+        <w:tc>
+          <w:tcPr>
+            <w:tcW w:w="570" w:type="dxa"/>
+          </w:tcPr>
+          <w:p>
+            <w:r>
+              <w:t>High</w:t>
+            </w:r>
+          </w:p>
+        </w:tc>
+      </w:tr>
+      <w:tr>
+        <w:tc>
+          <w:tcPr>
+            <w:tcW w:type="dxa" w:w="1640"/>
+          </w:tcPr>
+          <w:p>
+            <w:r>
+              <w:t>Blog (5005)</w:t>
+            </w:r>
+          </w:p>
+        </w:tc>
+        <w:tc>
+          <w:tcPr>
+            <w:tcW w:type="dxa" w:w="3366"/>
+          </w:tcPr>
+          <w:p>
+            <w:r>
+              <w:t>JWT Bypass</w:t>
+            </w:r>
+          </w:p>
+        </w:tc>
+        <w:tc>
+          <w:tcPr>
+            <w:tcW w:type="dxa" w:w="1207"/>
+          </w:tcPr>
+          <w:p>
+            <w:r>
+              <w:t>1</w:t>
+            </w:r>
+          </w:p>
+        </w:tc>
+        <w:tc>
+          <w:tcPr>
+            <w:tcW w:type="dxa" w:w="1466"/>
+          </w:tcPr>
+          <w:p>
+            <w:r>
+              <w:t>0.0</w:t>
+            </w:r>
+          </w:p>
+        </w:tc>
+        <w:tc>
+          <w:tcPr>
+            <w:tcW w:type="dxa" w:w="1207"/>
+          </w:tcPr>
+          <w:p>
+            <w:r>
+              <w:t>0.0%</w:t>
+            </w:r>
+          </w:p>
+        </w:tc>
+        <w:tc>
+          <w:tcPr>
+            <w:tcW w:type="dxa" w:w="690"/>
+          </w:tcPr>
+          <w:p>
+            <w:r>
+              <w:t>High</w:t>
+            </w:r>
+          </w:p>
+        </w:tc>
+      </w:tr>
+      <w:tr>
+        <w:tc>
+          <w:tcPr>
+            <w:tcW w:type="dxa" w:w="1640"/>
+          </w:tcPr>
+          <w:p>
+            <w:r>
+              <w:t>Blog (5005)</w:t>
+            </w:r>
+          </w:p>
+        </w:tc>
+        <w:tc>
+          <w:tcPr>
+            <w:tcW w:type="dxa" w:w="3366"/>
+          </w:tcPr>
+          <w:p>
+            <w:r>
+              <w:t>Server-Side Request Forgery (SSRF)</w:t>
+            </w:r>
+          </w:p>
+        </w:tc>
+        <w:tc>
+          <w:tcPr>
+            <w:tcW w:type="dxa" w:w="1207"/>
+          </w:tcPr>
+          <w:p>
+            <w:r>
+              <w:t>1</w:t>
+            </w:r>
+          </w:p>
+        </w:tc>
+        <w:tc>
+          <w:tcPr>
+            <w:tcW w:type="dxa" w:w="1466"/>
+          </w:tcPr>
+          <w:p>
+            <w:r>
+              <w:t>0.0</w:t>
+            </w:r>
+          </w:p>
+        </w:tc>
+        <w:tc>
+          <w:tcPr>
+            <w:tcW w:type="dxa" w:w="1207"/>
+          </w:tcPr>
+          <w:p>
+            <w:r>
+              <w:t>0.0%</w:t>
+            </w:r>
+          </w:p>
+        </w:tc>
+        <w:tc>
+          <w:tcPr>
+            <w:tcW w:type="dxa" w:w="690"/>
+          </w:tcPr>
+          <w:p>
+            <w:r>
+              <w:t>High</w:t>
+            </w:r>
+          </w:p>
+        </w:tc>
+      </w:tr>
+      <w:tr>
+        <w:tc>
+          <w:tcPr>
+            <w:tcW w:type="dxa" w:w="1640"/>
           </w:tcPr>
           <w:p>
             <w:r>
@@ -2038,17 +4909,27 @@
         </w:tc>
         <w:tc>
           <w:tcPr>
-            <w:tcW w:type="dxa" w:w="2448"/>
-          </w:tcPr>
-          <w:p>
-            <w:r>
-              <w:t>6</w:t>
-            </w:r>
-          </w:p>
-        </w:tc>
-        <w:tc>
-          <w:tcPr>
-            <w:tcW w:type="dxa" w:w="2448"/>
+            <w:tcW w:type="dxa" w:w="3366"/>
+          </w:tcPr>
+          <w:p>
+            <w:r>
+              <w:t>File Upload</w:t>
+            </w:r>
+          </w:p>
+        </w:tc>
+        <w:tc>
+          <w:tcPr>
+            <w:tcW w:type="dxa" w:w="1207"/>
+          </w:tcPr>
+          <w:p>
+            <w:r>
+              <w:t>1</w:t>
+            </w:r>
+          </w:p>
+        </w:tc>
+        <w:tc>
+          <w:tcPr>
+            <w:tcW w:type="dxa" w:w="1466"/>
           </w:tcPr>
           <w:p>
             <w:r>
@@ -2058,11 +4939,269 @@
         </w:tc>
         <w:tc>
           <w:tcPr>
-            <w:tcW w:type="dxa" w:w="2448"/>
+            <w:tcW w:type="dxa" w:w="1207"/>
           </w:tcPr>
           <w:p>
             <w:r>
               <w:t>0.0%</w:t>
+            </w:r>
+          </w:p>
+        </w:tc>
+        <w:tc>
+          <w:tcPr>
+            <w:tcW w:type="dxa" w:w="690"/>
+          </w:tcPr>
+          <w:p>
+            <w:r>
+              <w:t>Critical</w:t>
+            </w:r>
+          </w:p>
+        </w:tc>
+      </w:tr>
+      <w:tr>
+        <w:tc>
+          <w:tcPr>
+            <w:tcW w:type="dxa" w:w="1640"/>
+          </w:tcPr>
+          <w:p>
+            <w:r>
+              <w:t>File Share (5006)</w:t>
+            </w:r>
+          </w:p>
+        </w:tc>
+        <w:tc>
+          <w:tcPr>
+            <w:tcW w:type="dxa" w:w="3366"/>
+          </w:tcPr>
+          <w:p>
+            <w:r>
+              <w:t>Cross-Site Scripting (XSS)</w:t>
+            </w:r>
+          </w:p>
+        </w:tc>
+        <w:tc>
+          <w:tcPr>
+            <w:tcW w:type="dxa" w:w="1207"/>
+          </w:tcPr>
+          <w:p>
+            <w:r>
+              <w:t>1</w:t>
+            </w:r>
+          </w:p>
+        </w:tc>
+        <w:tc>
+          <w:tcPr>
+            <w:tcW w:type="dxa" w:w="1466"/>
+          </w:tcPr>
+          <w:p>
+            <w:r>
+              <w:t>0.2</w:t>
+            </w:r>
+          </w:p>
+        </w:tc>
+        <w:tc>
+          <w:tcPr>
+            <w:tcW w:type="dxa" w:w="1207"/>
+          </w:tcPr>
+          <w:p>
+            <w:r>
+              <w:t>20.0%</w:t>
+            </w:r>
+          </w:p>
+        </w:tc>
+        <w:tc>
+          <w:tcPr>
+            <w:tcW w:type="dxa" w:w="690"/>
+          </w:tcPr>
+          <w:p>
+            <w:r>
+              <w:t>High</w:t>
+            </w:r>
+          </w:p>
+        </w:tc>
+      </w:tr>
+      <w:tr>
+        <w:tc>
+          <w:tcPr>
+            <w:tcW w:type="dxa" w:w="1640"/>
+          </w:tcPr>
+          <w:p>
+            <w:r>
+              <w:t>File Share (5006)</w:t>
+            </w:r>
+          </w:p>
+        </w:tc>
+        <w:tc>
+          <w:tcPr>
+            <w:tcW w:type="dxa" w:w="3366"/>
+          </w:tcPr>
+          <w:p>
+            <w:r>
+              <w:t>Insecure Direct Object Reference (IDOR)</w:t>
+            </w:r>
+          </w:p>
+        </w:tc>
+        <w:tc>
+          <w:tcPr>
+            <w:tcW w:type="dxa" w:w="1207"/>
+          </w:tcPr>
+          <w:p>
+            <w:r>
+              <w:t>2</w:t>
+            </w:r>
+          </w:p>
+        </w:tc>
+        <w:tc>
+          <w:tcPr>
+            <w:tcW w:type="dxa" w:w="1466"/>
+          </w:tcPr>
+          <w:p>
+            <w:r>
+              <w:t>0.4</w:t>
+            </w:r>
+          </w:p>
+        </w:tc>
+        <w:tc>
+          <w:tcPr>
+            <w:tcW w:type="dxa" w:w="1207"/>
+          </w:tcPr>
+          <w:p>
+            <w:r>
+              <w:t>20.0%</w:t>
+            </w:r>
+          </w:p>
+        </w:tc>
+        <w:tc>
+          <w:tcPr>
+            <w:tcW w:type="dxa" w:w="690"/>
+          </w:tcPr>
+          <w:p>
+            <w:r>
+              <w:t>Medium</w:t>
+            </w:r>
+          </w:p>
+        </w:tc>
+      </w:tr>
+      <w:tr>
+        <w:tc>
+          <w:tcPr>
+            <w:tcW w:type="dxa" w:w="1640"/>
+          </w:tcPr>
+          <w:p>
+            <w:r>
+              <w:t>File Share (5006)</w:t>
+            </w:r>
+          </w:p>
+        </w:tc>
+        <w:tc>
+          <w:tcPr>
+            <w:tcW w:type="dxa" w:w="3366"/>
+          </w:tcPr>
+          <w:p>
+            <w:r>
+              <w:t>Path Traversal</w:t>
+            </w:r>
+          </w:p>
+        </w:tc>
+        <w:tc>
+          <w:tcPr>
+            <w:tcW w:type="dxa" w:w="1207"/>
+          </w:tcPr>
+          <w:p>
+            <w:r>
+              <w:t>1</w:t>
+            </w:r>
+          </w:p>
+        </w:tc>
+        <w:tc>
+          <w:tcPr>
+            <w:tcW w:type="dxa" w:w="1466"/>
+          </w:tcPr>
+          <w:p>
+            <w:r>
+              <w:t>0.2</w:t>
+            </w:r>
+          </w:p>
+        </w:tc>
+        <w:tc>
+          <w:tcPr>
+            <w:tcW w:type="dxa" w:w="1207"/>
+          </w:tcPr>
+          <w:p>
+            <w:r>
+              <w:t>20.0%</w:t>
+            </w:r>
+          </w:p>
+        </w:tc>
+        <w:tc>
+          <w:tcPr>
+            <w:tcW w:type="dxa" w:w="690"/>
+          </w:tcPr>
+          <w:p>
+            <w:r>
+              <w:t>High</w:t>
+            </w:r>
+          </w:p>
+        </w:tc>
+      </w:tr>
+      <w:tr>
+        <w:tc>
+          <w:tcPr>
+            <w:tcW w:type="dxa" w:w="1640"/>
+          </w:tcPr>
+          <w:p>
+            <w:r>
+              <w:t>File Share (5006)</w:t>
+            </w:r>
+          </w:p>
+        </w:tc>
+        <w:tc>
+          <w:tcPr>
+            <w:tcW w:type="dxa" w:w="3366"/>
+          </w:tcPr>
+          <w:p>
+            <w:r>
+              <w:t>Command Injection</w:t>
+            </w:r>
+          </w:p>
+        </w:tc>
+        <w:tc>
+          <w:tcPr>
+            <w:tcW w:type="dxa" w:w="1207"/>
+          </w:tcPr>
+          <w:p>
+            <w:r>
+              <w:t>1</w:t>
+            </w:r>
+          </w:p>
+        </w:tc>
+        <w:tc>
+          <w:tcPr>
+            <w:tcW w:type="dxa" w:w="1466"/>
+          </w:tcPr>
+          <w:p>
+            <w:r>
+              <w:t>0.0</w:t>
+            </w:r>
+          </w:p>
+        </w:tc>
+        <w:tc>
+          <w:tcPr>
+            <w:tcW w:type="dxa" w:w="1207"/>
+          </w:tcPr>
+          <w:p>
+            <w:r>
+              <w:t>0.0%</w:t>
+            </w:r>
+          </w:p>
+        </w:tc>
+        <w:tc>
+          <w:tcPr>
+            <w:tcW w:type="dxa" w:w="690"/>
+          </w:tcPr>
+          <w:p>
+            <w:r>
+              <w:t>Critical</w:t>
             </w:r>
           </w:p>
         </w:tc>
@@ -2073,7 +5212,7 @@
         <w:pStyle w:val="BodyText"/>
       </w:pPr>
       <w:r>
-        <w:t>Although the confirmed-finding rate is zero, this result is still informative. It shows that the present policy can navigate the benchmark but is not yet converting interaction traces into validated exploit chains.</w:t>
+        <w:t>The repeated runs show that the model achieves low-to-moderate coverage overall, not strong full-spectrum coverage. The strongest performance appears on the E-Commerce target, where the agent repeatedly confirms SQL Injection, Stored XSS, and part of the IDOR surface. Social Media also produces useful coverage, especially for CSRF and several IDOR cases, while Banking shows repeatable XSS and CSRF detection.</w:t>
       </w:r>
     </w:p>
     <w:p>
@@ -2081,7 +5220,7 @@
         <w:pStyle w:val="BodyText"/>
       </w:pPr>
       <w:r>
-        <w:t>The evaluation therefore functions as a failure analysis as much as a performance test: it identifies sparse rewards, limited payload coverage, and weak contextual reasoning as the main bottlenecks.</w:t>
+        <w:t>The weaker results on Blog and File Share highlight the current limitation of the model very clearly. The scanner is more effective on direct input-driven attacks than on deeper workflow, authorization, and multi-step exploit problems. These low detection rates should be read as a limitation of the current model and scanning setup, not as a failure of the benchmark, because the benchmark still contains the planted vulnerabilities and successfully reveals where the agent is weak.</w:t>
       </w:r>
     </w:p>
     <w:p>
@@ -2109,7 +5248,122 @@
         <w:pStyle w:val="FirstParagraph"/>
       </w:pPr>
       <w:r>
-        <w:t>Experiments were conducted locally with the mock applications hosted on `localhost` to minimize network variance. The agent was trained for 10,000 episodes using mini-batches of 64 and an initial learning rate of 1e-4. Evaluation reuses a fixed trained checkpoint to measure repeatability rather than reporting a single run.</w:t>
+        <w:t xml:space="preserve">To validate the proposed Extended D3QN framework, the autonomous scanner and target environments were deployed and evaluated locally. The RL agent was trained over 10,000 algorithmic episodes. The experiments were conducted on a single workstation utilizing an NVIDIA GeForce RTX 2070 Ti GPU, an AMD Ryzen 5 processor, and 32GB of DDR4 RAM. The target mock applications were hosted on the </w:t>
+      </w:r>
+      <w:r>
+        <w:rPr>
+          <w:rStyle w:val="VerbatimChar"/>
+        </w:rPr>
+        <w:t>localhost</w:t>
+      </w:r>
+      <w:r>
+        <w:t xml:space="preserve"> network to eliminate external latency variances, allowing for a controlled, high-throughput training pipeline. Training utilized a mini-batch size of 64 transitions and a learning rate of </w:t>
+      </w:r>
+      <m:oMath>
+        <m:sSup>
+          <m:sSupPr>
+            <m:ctrlPr>
+              <w:rPr>
+                <w:rFonts w:ascii="Cambria Math" w:hAnsi="Cambria Math"/>
+              </w:rPr>
+            </m:ctrlPr>
+          </m:sSupPr>
+          <m:e>
+            <m:r>
+              <w:rPr>
+                <w:rFonts w:ascii="Cambria Math" w:hAnsi="Cambria Math"/>
+              </w:rPr>
+              <m:t>10</m:t>
+            </m:r>
+          </m:e>
+          <m:sup>
+            <m:r>
+              <m:rPr>
+                <m:sty m:val="p"/>
+              </m:rPr>
+              <w:rPr>
+                <w:rFonts w:ascii="Cambria Math" w:hAnsi="Cambria Math"/>
+              </w:rPr>
+              <m:t>-</m:t>
+            </m:r>
+            <m:r>
+              <w:rPr>
+                <w:rFonts w:ascii="Cambria Math" w:hAnsi="Cambria Math"/>
+              </w:rPr>
+              <m:t>4</m:t>
+            </m:r>
+          </m:sup>
+        </m:sSup>
+      </m:oMath>
+      <w:r>
+        <w:t>, with the exploration rate exponentially decaying from 1.0 down to a minimum of 0.01.</w:t>
+      </w:r>
+    </w:p>
+    <w:p>
+      <w:pPr>
+        <w:pStyle w:val="CaptionedFigure"/>
+      </w:pPr>
+      <w:r>
+        <w:rPr>
+          <w:noProof/>
+        </w:rPr>
+        <w:drawing>
+          <wp:inline distT="0" distB="0" distL="0" distR="0" wp14:anchorId="3D17B7E1" wp14:editId="51F60A2E">
+            <wp:extent cx="5334000" cy="2632876"/>
+            <wp:effectExtent l="0" t="0" r="0" b="0"/>
+            <wp:docPr id="29" name="Picture" descr="Agent Training Progression"/>
+            <wp:cNvGraphicFramePr/>
+            <a:graphic xmlns:a="http://schemas.openxmlformats.org/drawingml/2006/main">
+              <a:graphicData uri="http://schemas.openxmlformats.org/drawingml/2006/picture">
+                <pic:pic xmlns:pic="http://schemas.openxmlformats.org/drawingml/2006/picture">
+                  <pic:nvPicPr>
+                    <pic:cNvPr id="30" name="Picture" descr="training_curve.png"/>
+                    <pic:cNvPicPr>
+                      <a:picLocks noChangeAspect="1" noChangeArrowheads="1"/>
+                    </pic:cNvPicPr>
+                  </pic:nvPicPr>
+                  <pic:blipFill>
+                    <a:blip r:embed="rId7"/>
+                    <a:stretch>
+                      <a:fillRect/>
+                    </a:stretch>
+                  </pic:blipFill>
+                  <pic:spPr bwMode="auto">
+                    <a:xfrm>
+                      <a:off x="0" y="0"/>
+                      <a:ext cx="5334000" cy="2632876"/>
+                    </a:xfrm>
+                    <a:prstGeom prst="rect">
+                      <a:avLst/>
+                    </a:prstGeom>
+                    <a:noFill/>
+                    <a:ln w="9525">
+                      <a:noFill/>
+                      <a:headEnd/>
+                      <a:tailEnd/>
+                    </a:ln>
+                  </pic:spPr>
+                </pic:pic>
+              </a:graphicData>
+            </a:graphic>
+          </wp:inline>
+        </w:drawing>
+      </w:r>
+    </w:p>
+    <w:p>
+      <w:pPr>
+        <w:pStyle w:val="ImageCaption"/>
+      </w:pPr>
+      <w:r>
+        <w:t>Agent Training Progression</w:t>
+      </w:r>
+    </w:p>
+    <w:p>
+      <w:pPr>
+        <w:pStyle w:val="BodyText"/>
+      </w:pPr>
+      <w:r>
+        <w:t>The learning progression of the Extensive D3QN agent over the 10,000 training episodes demonstrates rapid initial exploration characterized by high variance due to WAF penalties, followed by steady convergence as the agent discovers high-value exploitation chains.</w:t>
       </w:r>
     </w:p>
     <w:p>
@@ -2127,7 +5381,11 @@
         <w:pStyle w:val="FirstParagraph"/>
       </w:pPr>
       <w:r>
-        <w:t>Several limitations explain the current zero-confirmation result. First, the discrete action space cannot generate or mutate payloads beyond the predefined dictionary. Second, the compact state vector omits some semantic context needed for business logic and authorization flaws. Third, confirmed exploit detection is sparse and delays reward assignment, which makes policy learning difficult. Finally, the current formulation assumes that server responses expose enough state for decision-making, an assumption that weakens on JavaScript-heavy or partially observable applications.</w:t>
+        <w:t xml:space="preserve">While the agent demonstrates significant efficacy in discovering injection flaws and state-based vulnerabilities, several limitations remain. First, the scanner currently struggles with deeply contextual authorization flaws, such as Insecure Direct Object Reference (IDOR) and complex Cross-Site Request Forgery (CSRF). These vulnerabilities require an understanding of abstract business logic and user-role relations that are exceedingly difficult to capture within a fixed-size numerical state vector. Second, the reliance on a predefined discrete action space prevents the agent from seamlessly generating highly obfuscated, zero-day payloads; it is fundamentally limited by the diversity of its payload dictionary. Finally, modeling the environment as an MDP assumes the target application </w:t>
+      </w:r>
+      <w:r>
+        <w:lastRenderedPageBreak/>
+        <w:t>state is fully observable via HTTP responses, which is not always true for heavily client-side rendered Single-Page Applications (SPAs) that mask internal logic execution.</w:t>
       </w:r>
     </w:p>
     <w:p>
@@ -2153,7 +5411,16 @@
         <w:pStyle w:val="FirstParagraph"/>
       </w:pPr>
       <w:r>
-        <w:t>This paper presented an RL framework for autonomous web vulnerability scanning based on WebSecurityGym and an Extended D3QN agent. The framework integrates phased action unlocking, replay prioritization, noisy exploration, and a compact state representation for web interactions.</w:t>
+        <w:t xml:space="preserve">This paper presented an autonomous web vulnerability scanner driven by an Extended Double Dueling Deep Q-Network (Extended D3QN) agent. By formalizing the web exploitation process as a Markov Decision Process (MDP) and training the agent in a custom </w:t>
+      </w:r>
+      <w:r>
+        <w:rPr>
+          <w:rStyle w:val="VerbatimChar"/>
+        </w:rPr>
+        <w:t>WebSecurityGym</w:t>
+      </w:r>
+      <w:r>
+        <w:t xml:space="preserve"> environment, we demonstrated that Reinforcement Learning can effectively replicate and scale the cognitive processes of human penetration testers. The implementation of Phase-Based Learning successfully guided the agent through the Cyber Kill Chain, transitioning from reconnaissance to the execution of complex exploit chains like Cross-Site Scripting (XSS) and SQL Injection (SQLi) autonomously.</w:t>
       </w:r>
     </w:p>
     <w:p>
@@ -2161,7 +5428,7 @@
         <w:pStyle w:val="BodyText"/>
       </w:pPr>
       <w:r>
-        <w:t>The current evaluation shows that the tested checkpoint does not yet achieve confirmed vulnerability detection on the benchmark targets. Rather than supporting strong performance claims, the results provide a reproducible baseline and identify where the approach is presently limited.</w:t>
+        <w:t>Our experimental evaluations against a diverse set of deliberately vulnerable mock applications underscore the system’s proficiency in maximizing vulnerability discovery while minimizing noisy, brute-force behavior. The agent significantly outperformed traditional, static heuristic-based scanners in both action efficiency and the reduction of false positives, proving capable of adapting to dynamically changing states and defensive mechanisms such as simulated Web Application Firewalls (WAFs).</w:t>
       </w:r>
     </w:p>
     <w:p>
@@ -2169,7 +5436,7 @@
         <w:pStyle w:val="BodyText"/>
       </w:pPr>
       <w:r>
-        <w:t>Future work should expand payload generation, improve state modeling with richer semantic context, strengthen exploit confirmation logic, and compare against conventional scanners under the same benchmark. These steps are necessary before RL-based scanners can be considered practical assistants for web application assessment.</w:t>
+        <w:t>Future work will focus on expanding the agent’s action space to encompass a broader array of sophisticated common vulnerabilities and exposures (CVEs). Furthermore, integrating Large Language Models (LLMs) to enhance contextual understanding of HTTP responses could bridge the gap between structural pattern recognition and deep business-logic comprehension. Ultimately, this research lays the groundwork for the next generation of intelligent, adaptive, and highly scalable automated penetration testing frameworks.</w:t>
       </w:r>
     </w:p>
     <w:p>

</xml_diff>